<commit_message>
Update a new version based on the new UI
</commit_message>
<xml_diff>
--- a/user menu.docx
+++ b/user menu.docx
@@ -6,20 +6,18 @@
       <w:pPr>
         <w:jc w:val="center"/>
         <w:rPr>
-          <w:rFonts w:ascii="Segoe Fluent Icons" w:hAnsi="Segoe Fluent Icons"/>
-          <w:b/>
-          <w:bCs/>
-          <w:sz w:val="30"/>
-          <w:szCs w:val="30"/>
-        </w:rPr>
-      </w:pPr>
-      <w:r>
-        <w:rPr>
-          <w:rFonts w:ascii="Segoe Fluent Icons" w:hAnsi="Segoe Fluent Icons"/>
-          <w:b/>
-          <w:bCs/>
-          <w:sz w:val="30"/>
-          <w:szCs w:val="30"/>
+          <w:rFonts w:ascii="Times New Roman" w:hAnsi="Times New Roman" w:cs="Times New Roman"/>
+          <w:color w:val="0F4761" w:themeColor="accent1" w:themeShade="BF"/>
+          <w:sz w:val="32"/>
+          <w:szCs w:val="32"/>
+        </w:rPr>
+      </w:pPr>
+      <w:r>
+        <w:rPr>
+          <w:rFonts w:ascii="Times New Roman" w:hAnsi="Times New Roman" w:cs="Times New Roman"/>
+          <w:color w:val="0F4761" w:themeColor="accent1" w:themeShade="BF"/>
+          <w:sz w:val="32"/>
+          <w:szCs w:val="32"/>
         </w:rPr>
         <w:t>User Manual of AI Personal Finance Tracker</w:t>
       </w:r>
@@ -28,20 +26,18 @@
       <w:pPr>
         <w:jc w:val="center"/>
         <w:rPr>
-          <w:rFonts w:ascii="Segoe Fluent Icons" w:hAnsi="Segoe Fluent Icons"/>
-          <w:b/>
-          <w:bCs/>
-          <w:sz w:val="30"/>
-          <w:szCs w:val="30"/>
-        </w:rPr>
-      </w:pPr>
-      <w:r>
-        <w:rPr>
-          <w:rFonts w:ascii="Segoe Fluent Icons" w:hAnsi="Segoe Fluent Icons"/>
-          <w:b/>
-          <w:bCs/>
-          <w:sz w:val="30"/>
-          <w:szCs w:val="30"/>
+          <w:rFonts w:ascii="Times New Roman" w:hAnsi="Times New Roman" w:cs="Times New Roman"/>
+          <w:color w:val="0F4761" w:themeColor="accent1" w:themeShade="BF"/>
+          <w:sz w:val="32"/>
+          <w:szCs w:val="32"/>
+        </w:rPr>
+      </w:pPr>
+      <w:r>
+        <w:rPr>
+          <w:rFonts w:ascii="Times New Roman" w:hAnsi="Times New Roman" w:cs="Times New Roman"/>
+          <w:color w:val="0F4761" w:themeColor="accent1" w:themeShade="BF"/>
+          <w:sz w:val="32"/>
+          <w:szCs w:val="32"/>
         </w:rPr>
         <w:t>Group 52</w:t>
       </w:r>
@@ -51,32 +47,45 @@
         <w:pStyle w:val="21bc9c4b-6a32-43e5-beaa-fd2d792c5735"/>
         <w:spacing w:line="240" w:lineRule="auto"/>
         <w:rPr>
-          <w:rFonts w:ascii="Segoe Fluent Icons" w:hAnsi="Segoe Fluent Icons"/>
-          <w:sz w:val="24"/>
-          <w:szCs w:val="24"/>
-        </w:rPr>
-      </w:pPr>
-      <w:r>
-        <w:rPr>
-          <w:rFonts w:ascii="Segoe Fluent Icons" w:hAnsi="Segoe Fluent Icons"/>
-          <w:sz w:val="24"/>
-          <w:szCs w:val="24"/>
+          <w:rFonts w:ascii="Times New Roman" w:hAnsi="Times New Roman" w:cs="Times New Roman"/>
+          <w:b w:val="0"/>
+          <w:color w:val="0F4761" w:themeColor="accent1" w:themeShade="BF"/>
+          <w:szCs w:val="32"/>
+        </w:rPr>
+      </w:pPr>
+      <w:r>
+        <w:rPr>
+          <w:rFonts w:ascii="Times New Roman" w:hAnsi="Times New Roman" w:cs="Times New Roman" w:hint="eastAsia"/>
+          <w:b w:val="0"/>
+          <w:color w:val="0F4761" w:themeColor="accent1" w:themeShade="BF"/>
+          <w:szCs w:val="32"/>
+        </w:rPr>
+        <w:t>1.</w:t>
+      </w:r>
+      <w:r>
+        <w:rPr>
+          <w:rFonts w:ascii="Times New Roman" w:hAnsi="Times New Roman" w:cs="Times New Roman"/>
+          <w:b w:val="0"/>
+          <w:color w:val="0F4761" w:themeColor="accent1" w:themeShade="BF"/>
+          <w:szCs w:val="32"/>
         </w:rPr>
         <w:t>Login</w:t>
       </w:r>
       <w:r>
         <w:rPr>
-          <w:rFonts w:ascii="Segoe Fluent Icons" w:hAnsi="Segoe Fluent Icons"/>
-          <w:sz w:val="24"/>
-          <w:szCs w:val="24"/>
+          <w:rFonts w:ascii="Times New Roman" w:hAnsi="Times New Roman" w:cs="Times New Roman"/>
+          <w:b w:val="0"/>
+          <w:color w:val="0F4761" w:themeColor="accent1" w:themeShade="BF"/>
+          <w:szCs w:val="32"/>
         </w:rPr>
         <w:t xml:space="preserve"> &amp; Registration </w:t>
       </w:r>
       <w:r>
         <w:rPr>
-          <w:rFonts w:ascii="Segoe Fluent Icons" w:hAnsi="Segoe Fluent Icons"/>
-          <w:sz w:val="24"/>
-          <w:szCs w:val="24"/>
+          <w:rFonts w:ascii="Times New Roman" w:hAnsi="Times New Roman" w:cs="Times New Roman"/>
+          <w:b w:val="0"/>
+          <w:color w:val="0F4761" w:themeColor="accent1" w:themeShade="BF"/>
+          <w:szCs w:val="32"/>
         </w:rPr>
         <w:t>Page</w:t>
       </w:r>
@@ -89,26 +98,26 @@
           <w:numId w:val="2"/>
         </w:numPr>
         <w:rPr>
-          <w:rFonts w:ascii="Segoe Fluent Icons" w:hAnsi="Segoe Fluent Icons"/>
-        </w:rPr>
-      </w:pPr>
-      <w:r>
-        <w:rPr>
-          <w:rFonts w:ascii="Segoe Fluent Icons" w:hAnsi="Segoe Fluent Icons"/>
+          <w:rFonts w:ascii="Times New Roman" w:hAnsi="Times New Roman" w:cs="Times New Roman"/>
+        </w:rPr>
+      </w:pPr>
+      <w:r>
+        <w:rPr>
+          <w:rFonts w:ascii="Times New Roman" w:hAnsi="Times New Roman" w:cs="Times New Roman"/>
         </w:rPr>
         <w:t xml:space="preserve">After launching the application, you will be taken to the </w:t>
       </w:r>
       <w:proofErr w:type="spellStart"/>
       <w:r>
         <w:rPr>
-          <w:rFonts w:ascii="Segoe Fluent Icons" w:hAnsi="Segoe Fluent Icons"/>
+          <w:rFonts w:ascii="Times New Roman" w:hAnsi="Times New Roman" w:cs="Times New Roman"/>
         </w:rPr>
         <w:t>BuckBrain</w:t>
       </w:r>
       <w:proofErr w:type="spellEnd"/>
       <w:r>
         <w:rPr>
-          <w:rFonts w:ascii="Segoe Fluent Icons" w:hAnsi="Segoe Fluent Icons"/>
+          <w:rFonts w:ascii="Times New Roman" w:hAnsi="Times New Roman" w:cs="Times New Roman"/>
         </w:rPr>
         <w:t xml:space="preserve"> Login Page.</w:t>
       </w:r>
@@ -121,12 +130,12 @@
           <w:numId w:val="2"/>
         </w:numPr>
         <w:rPr>
-          <w:rFonts w:ascii="Segoe Fluent Icons" w:hAnsi="Segoe Fluent Icons"/>
-        </w:rPr>
-      </w:pPr>
-      <w:r>
-        <w:rPr>
-          <w:rFonts w:ascii="Segoe Fluent Icons" w:hAnsi="Segoe Fluent Icons"/>
+          <w:rFonts w:ascii="Times New Roman" w:hAnsi="Times New Roman" w:cs="Times New Roman"/>
+        </w:rPr>
+      </w:pPr>
+      <w:r>
+        <w:rPr>
+          <w:rFonts w:ascii="Times New Roman" w:hAnsi="Times New Roman" w:cs="Times New Roman"/>
         </w:rPr>
         <w:t>Users need to enter Username and Password in the page.</w:t>
       </w:r>
@@ -136,16 +145,16 @@
         <w:pStyle w:val="af"/>
         <w:ind w:left="440"/>
         <w:rPr>
-          <w:rFonts w:ascii="Segoe Fluent Icons" w:hAnsi="Segoe Fluent Icons"/>
-        </w:rPr>
-      </w:pPr>
-      <w:r>
-        <w:rPr>
-          <w:rFonts w:ascii="Segoe Fluent Icons" w:hAnsi="Segoe Fluent Icons"/>
+          <w:rFonts w:ascii="Times New Roman" w:hAnsi="Times New Roman" w:cs="Times New Roman"/>
+        </w:rPr>
+      </w:pPr>
+      <w:r>
+        <w:rPr>
+          <w:rFonts w:ascii="Times New Roman" w:hAnsi="Times New Roman" w:cs="Times New Roman"/>
           <w:noProof/>
         </w:rPr>
         <w:drawing>
-          <wp:inline distT="0" distB="0" distL="0" distR="0" wp14:anchorId="72894C23" wp14:editId="7D59DDEF">
+          <wp:inline distT="0" distB="0" distL="0" distR="0" wp14:anchorId="72894C23" wp14:editId="33873F08">
             <wp:extent cx="5274310" cy="3502660"/>
             <wp:effectExtent l="0" t="0" r="2540" b="2540"/>
             <wp:docPr id="1072545523" name="图片 1" descr="用户上传的图片"/>
@@ -202,12 +211,12 @@
           <w:numId w:val="2"/>
         </w:numPr>
         <w:rPr>
-          <w:rFonts w:ascii="Segoe Fluent Icons" w:hAnsi="Segoe Fluent Icons"/>
-        </w:rPr>
-      </w:pPr>
-      <w:r>
-        <w:rPr>
-          <w:rFonts w:ascii="Segoe Fluent Icons" w:hAnsi="Segoe Fluent Icons"/>
+          <w:rFonts w:ascii="Times New Roman" w:hAnsi="Times New Roman" w:cs="Times New Roman"/>
+        </w:rPr>
+      </w:pPr>
+      <w:r>
+        <w:rPr>
+          <w:rFonts w:ascii="Times New Roman" w:hAnsi="Times New Roman" w:cs="Times New Roman"/>
         </w:rPr>
         <w:t>Click the blue button Login to log into the system; click the grey button Register to enter the registration page to create a new account.</w:t>
       </w:r>
@@ -215,14 +224,14 @@
     <w:p>
       <w:pPr>
         <w:rPr>
-          <w:rFonts w:ascii="Segoe Fluent Icons" w:hAnsi="Segoe Fluent Icons"/>
-          <w:sz w:val="24"/>
-          <w:szCs w:val="24"/>
-        </w:rPr>
-      </w:pPr>
-      <w:r>
-        <w:rPr>
-          <w:rFonts w:ascii="Segoe Fluent Icons" w:hAnsi="Segoe Fluent Icons"/>
+          <w:rFonts w:ascii="Times New Roman" w:hAnsi="Times New Roman" w:cs="Times New Roman"/>
+          <w:sz w:val="24"/>
+          <w:szCs w:val="24"/>
+        </w:rPr>
+      </w:pPr>
+      <w:r>
+        <w:rPr>
+          <w:rFonts w:ascii="Times New Roman" w:hAnsi="Times New Roman" w:cs="Times New Roman"/>
           <w:noProof/>
           <w:sz w:val="24"/>
           <w:szCs w:val="24"/>
@@ -270,16 +279,18 @@
         <w:pStyle w:val="21bc9c4b-6a32-43e5-beaa-fd2d792c5735"/>
         <w:spacing w:line="240" w:lineRule="auto"/>
         <w:rPr>
-          <w:rFonts w:ascii="Segoe Fluent Icons" w:hAnsi="Segoe Fluent Icons"/>
-          <w:sz w:val="24"/>
-          <w:szCs w:val="24"/>
-        </w:rPr>
-      </w:pPr>
-      <w:r>
-        <w:rPr>
-          <w:rFonts w:ascii="Segoe Fluent Icons" w:hAnsi="Segoe Fluent Icons"/>
-          <w:sz w:val="24"/>
-          <w:szCs w:val="24"/>
+          <w:rFonts w:ascii="Times New Roman" w:hAnsi="Times New Roman" w:cs="Times New Roman"/>
+          <w:b w:val="0"/>
+          <w:color w:val="0F4761" w:themeColor="accent1" w:themeShade="BF"/>
+          <w:szCs w:val="32"/>
+        </w:rPr>
+      </w:pPr>
+      <w:r>
+        <w:rPr>
+          <w:rFonts w:ascii="Times New Roman" w:hAnsi="Times New Roman" w:cs="Times New Roman"/>
+          <w:b w:val="0"/>
+          <w:color w:val="0F4761" w:themeColor="accent1" w:themeShade="BF"/>
+          <w:szCs w:val="32"/>
         </w:rPr>
         <w:t>Functional Module</w:t>
       </w:r>
@@ -288,16 +299,18 @@
       <w:pPr>
         <w:pStyle w:val="71e7dc79-1ff7-45e8-997d-0ebda3762b91"/>
         <w:rPr>
-          <w:rFonts w:ascii="Segoe Fluent Icons" w:hAnsi="Segoe Fluent Icons"/>
-          <w:sz w:val="24"/>
-          <w:szCs w:val="24"/>
-        </w:rPr>
-      </w:pPr>
-      <w:r>
-        <w:rPr>
-          <w:rFonts w:ascii="Segoe Fluent Icons" w:hAnsi="Segoe Fluent Icons"/>
-          <w:sz w:val="24"/>
-          <w:szCs w:val="24"/>
+          <w:rFonts w:ascii="Times New Roman" w:hAnsi="Times New Roman" w:cs="Times New Roman"/>
+          <w:b w:val="0"/>
+          <w:color w:val="0F4761" w:themeColor="accent1" w:themeShade="BF"/>
+          <w:szCs w:val="28"/>
+        </w:rPr>
+      </w:pPr>
+      <w:r>
+        <w:rPr>
+          <w:rFonts w:ascii="Times New Roman" w:hAnsi="Times New Roman" w:cs="Times New Roman"/>
+          <w:b w:val="0"/>
+          <w:color w:val="0F4761" w:themeColor="accent1" w:themeShade="BF"/>
+          <w:szCs w:val="28"/>
         </w:rPr>
         <w:t>2.1 Dashboard</w:t>
       </w:r>
@@ -311,14 +324,14 @@
         </w:numPr>
         <w:spacing w:line="240" w:lineRule="auto"/>
         <w:rPr>
-          <w:rFonts w:ascii="Segoe Fluent Icons" w:hAnsi="Segoe Fluent Icons"/>
-          <w:sz w:val="24"/>
-          <w:szCs w:val="24"/>
-        </w:rPr>
-      </w:pPr>
-      <w:r>
-        <w:rPr>
-          <w:rFonts w:ascii="Segoe Fluent Icons" w:hAnsi="Segoe Fluent Icons"/>
+          <w:rFonts w:ascii="Times New Roman" w:hAnsi="Times New Roman" w:cs="Times New Roman"/>
+          <w:sz w:val="24"/>
+          <w:szCs w:val="24"/>
+        </w:rPr>
+      </w:pPr>
+      <w:r>
+        <w:rPr>
+          <w:rFonts w:ascii="Times New Roman" w:hAnsi="Times New Roman" w:cs="Times New Roman"/>
           <w:sz w:val="24"/>
           <w:szCs w:val="24"/>
         </w:rPr>
@@ -334,23 +347,22 @@
         </w:numPr>
         <w:spacing w:line="240" w:lineRule="auto"/>
         <w:rPr>
-          <w:rFonts w:ascii="Segoe Fluent Icons" w:hAnsi="Segoe Fluent Icons"/>
-          <w:sz w:val="24"/>
-          <w:szCs w:val="24"/>
-        </w:rPr>
-      </w:pPr>
-      <w:r>
-        <w:rPr>
-          <w:rFonts w:ascii="Segoe Fluent Icons" w:hAnsi="Segoe Fluent Icons"/>
-          <w:noProof/>
+          <w:rFonts w:ascii="Times New Roman" w:hAnsi="Times New Roman" w:cs="Times New Roman"/>
+          <w:sz w:val="24"/>
+          <w:szCs w:val="24"/>
+        </w:rPr>
+      </w:pPr>
+      <w:r>
+        <w:rPr>
+          <w:rFonts w:ascii="Times New Roman" w:hAnsi="Times New Roman" w:cs="Times New Roman"/>
           <w:sz w:val="24"/>
           <w:szCs w:val="24"/>
         </w:rPr>
         <w:drawing>
-          <wp:inline distT="0" distB="0" distL="0" distR="0" wp14:anchorId="574F38F7" wp14:editId="112D7103">
-            <wp:extent cx="5274310" cy="3520440"/>
-            <wp:effectExtent l="0" t="0" r="2540" b="3810"/>
-            <wp:docPr id="1536587218" name="图片 1"/>
+          <wp:inline distT="0" distB="0" distL="0" distR="0" wp14:anchorId="5D0B3EE7" wp14:editId="4AEE9C98">
+            <wp:extent cx="5274310" cy="3499485"/>
+            <wp:effectExtent l="0" t="0" r="2540" b="5715"/>
+            <wp:docPr id="1780449489" name="图片 1"/>
             <wp:cNvGraphicFramePr>
               <a:graphicFrameLocks xmlns:a="http://schemas.openxmlformats.org/drawingml/2006/main" noChangeAspect="1"/>
             </wp:cNvGraphicFramePr>
@@ -358,7 +370,7 @@
               <a:graphicData uri="http://schemas.openxmlformats.org/drawingml/2006/picture">
                 <pic:pic xmlns:pic="http://schemas.openxmlformats.org/drawingml/2006/picture">
                   <pic:nvPicPr>
-                    <pic:cNvPr id="1204499829" name=""/>
+                    <pic:cNvPr id="1780449489" name=""/>
                     <pic:cNvPicPr/>
                   </pic:nvPicPr>
                   <pic:blipFill>
@@ -370,7 +382,7 @@
                   <pic:spPr>
                     <a:xfrm>
                       <a:off x="0" y="0"/>
-                      <a:ext cx="5274310" cy="3520440"/>
+                      <a:ext cx="5274310" cy="3499485"/>
                     </a:xfrm>
                     <a:prstGeom prst="rect">
                       <a:avLst/>
@@ -392,24 +404,99 @@
         </w:numPr>
         <w:spacing w:line="240" w:lineRule="auto"/>
         <w:rPr>
-          <w:rFonts w:ascii="Segoe Fluent Icons" w:hAnsi="Segoe Fluent Icons"/>
-          <w:sz w:val="24"/>
-          <w:szCs w:val="24"/>
-        </w:rPr>
-      </w:pPr>
-      <w:r>
-        <w:rPr>
-          <w:rFonts w:ascii="Segoe Fluent Icons" w:hAnsi="Segoe Fluent Icons"/>
-          <w:noProof/>
-          <w:sz w:val="24"/>
-          <w:szCs w:val="24"/>
+          <w:rFonts w:ascii="Times New Roman" w:hAnsi="Times New Roman" w:cs="Times New Roman"/>
+          <w:sz w:val="24"/>
+          <w:szCs w:val="24"/>
+        </w:rPr>
+      </w:pPr>
+    </w:p>
+    <w:p>
+      <w:pPr>
+        <w:pStyle w:val="acbfdd8b-e11b-4d36-88ff-6049b138f862"/>
+        <w:numPr>
+          <w:ilvl w:val="0"/>
+          <w:numId w:val="3"/>
+        </w:numPr>
+        <w:rPr>
+          <w:rFonts w:ascii="Times New Roman" w:hAnsi="Times New Roman" w:cs="Times New Roman"/>
+        </w:rPr>
+      </w:pPr>
+      <w:r>
+        <w:rPr>
+          <w:rFonts w:ascii="Times New Roman" w:hAnsi="Times New Roman" w:cs="Times New Roman"/>
+          <w:sz w:val="24"/>
+          <w:szCs w:val="24"/>
+        </w:rPr>
+        <w:t>Manual Add and Import File buttons are available at the bottom</w:t>
+      </w:r>
+      <w:r>
+        <w:rPr>
+          <w:rFonts w:ascii="Times New Roman" w:hAnsi="Times New Roman" w:cs="Times New Roman"/>
+          <w:sz w:val="24"/>
+          <w:szCs w:val="24"/>
+        </w:rPr>
+        <w:t xml:space="preserve">, </w:t>
+      </w:r>
+      <w:r>
+        <w:rPr>
+          <w:rFonts w:ascii="Times New Roman" w:hAnsi="Times New Roman" w:cs="Times New Roman"/>
+        </w:rPr>
+        <w:t>t</w:t>
+      </w:r>
+      <w:r>
+        <w:rPr>
+          <w:rFonts w:ascii="Times New Roman" w:hAnsi="Times New Roman" w:cs="Times New Roman"/>
+        </w:rPr>
+        <w:t xml:space="preserve">he newly added </w:t>
+      </w:r>
+      <w:r>
+        <w:rPr>
+          <w:rFonts w:ascii="Times New Roman" w:hAnsi="Times New Roman" w:cs="Times New Roman"/>
         </w:rPr>
         <w:lastRenderedPageBreak/>
+        <w:t>transaction record will show</w:t>
+      </w:r>
+    </w:p>
+    <w:p>
+      <w:pPr>
+        <w:pStyle w:val="acbfdd8b-e11b-4d36-88ff-6049b138f862"/>
+        <w:numPr>
+          <w:ilvl w:val="0"/>
+          <w:numId w:val="0"/>
+        </w:numPr>
+        <w:spacing w:line="240" w:lineRule="auto"/>
+        <w:rPr>
+          <w:rFonts w:ascii="Times New Roman" w:hAnsi="Times New Roman" w:cs="Times New Roman"/>
+          <w:sz w:val="24"/>
+          <w:szCs w:val="24"/>
+        </w:rPr>
+      </w:pPr>
+    </w:p>
+    <w:p>
+      <w:pPr>
+        <w:pStyle w:val="acbfdd8b-e11b-4d36-88ff-6049b138f862"/>
+        <w:numPr>
+          <w:ilvl w:val="0"/>
+          <w:numId w:val="0"/>
+        </w:numPr>
+        <w:spacing w:line="240" w:lineRule="auto"/>
+        <w:rPr>
+          <w:rFonts w:ascii="Times New Roman" w:hAnsi="Times New Roman" w:cs="Times New Roman"/>
+          <w:sz w:val="24"/>
+          <w:szCs w:val="24"/>
+        </w:rPr>
+      </w:pPr>
+      <w:r>
+        <w:rPr>
+          <w:rFonts w:ascii="Times New Roman" w:hAnsi="Times New Roman" w:cs="Times New Roman"/>
+          <w:sz w:val="24"/>
+          <w:szCs w:val="24"/>
+        </w:rPr>
         <w:drawing>
-          <wp:inline distT="0" distB="0" distL="0" distR="0" wp14:anchorId="0D98972B" wp14:editId="6A9B7271">
-            <wp:extent cx="5274310" cy="3505200"/>
-            <wp:effectExtent l="0" t="0" r="2540" b="0"/>
-            <wp:docPr id="332868295" name="图片 1"/>
+          <wp:inline distT="0" distB="0" distL="0" distR="0" wp14:anchorId="41BC6AF0" wp14:editId="7C8ED07A">
+            <wp:extent cx="5274310" cy="3556000"/>
+            <wp:effectExtent l="0" t="0" r="2540" b="6350"/>
+            <wp:docPr id="1007333661" name="图片 1"/>
             <wp:cNvGraphicFramePr>
               <a:graphicFrameLocks xmlns:a="http://schemas.openxmlformats.org/drawingml/2006/main" noChangeAspect="1"/>
             </wp:cNvGraphicFramePr>
@@ -417,7 +504,7 @@
               <a:graphicData uri="http://schemas.openxmlformats.org/drawingml/2006/picture">
                 <pic:pic xmlns:pic="http://schemas.openxmlformats.org/drawingml/2006/picture">
                   <pic:nvPicPr>
-                    <pic:cNvPr id="1181574679" name=""/>
+                    <pic:cNvPr id="1007333661" name=""/>
                     <pic:cNvPicPr/>
                   </pic:nvPicPr>
                   <pic:blipFill>
@@ -429,7 +516,7 @@
                   <pic:spPr>
                     <a:xfrm>
                       <a:off x="0" y="0"/>
-                      <a:ext cx="5274310" cy="3505200"/>
+                      <a:ext cx="5274310" cy="3556000"/>
                     </a:xfrm>
                     <a:prstGeom prst="rect">
                       <a:avLst/>
@@ -444,45 +531,155 @@
     </w:p>
     <w:p>
       <w:pPr>
+        <w:rPr>
+          <w:rFonts w:ascii="Times New Roman" w:hAnsi="Times New Roman" w:cs="Times New Roman"/>
+        </w:rPr>
+      </w:pPr>
+      <w:r>
+        <w:rPr>
+          <w:rFonts w:ascii="Times New Roman" w:hAnsi="Times New Roman" w:cs="Times New Roman"/>
+          <w:noProof/>
+        </w:rPr>
+        <w:drawing>
+          <wp:inline distT="0" distB="0" distL="0" distR="0" wp14:anchorId="303B3965" wp14:editId="5056F87A">
+            <wp:extent cx="5274310" cy="3549015"/>
+            <wp:effectExtent l="0" t="0" r="2540" b="0"/>
+            <wp:docPr id="1468025390" name="图片 2"/>
+            <wp:cNvGraphicFramePr>
+              <a:graphicFrameLocks xmlns:a="http://schemas.openxmlformats.org/drawingml/2006/main" noChangeAspect="1"/>
+            </wp:cNvGraphicFramePr>
+            <a:graphic xmlns:a="http://schemas.openxmlformats.org/drawingml/2006/main">
+              <a:graphicData uri="http://schemas.openxmlformats.org/drawingml/2006/picture">
+                <pic:pic xmlns:pic="http://schemas.openxmlformats.org/drawingml/2006/picture">
+                  <pic:nvPicPr>
+                    <pic:cNvPr id="0" name="Picture 2"/>
+                    <pic:cNvPicPr>
+                      <a:picLocks noChangeAspect="1" noChangeArrowheads="1"/>
+                    </pic:cNvPicPr>
+                  </pic:nvPicPr>
+                  <pic:blipFill>
+                    <a:blip r:embed="rId12" cstate="print">
+                      <a:extLst>
+                        <a:ext uri="{28A0092B-C50C-407E-A947-70E740481C1C}">
+                          <a14:useLocalDpi xmlns:a14="http://schemas.microsoft.com/office/drawing/2010/main" val="0"/>
+                        </a:ext>
+                      </a:extLst>
+                    </a:blip>
+                    <a:srcRect/>
+                    <a:stretch>
+                      <a:fillRect/>
+                    </a:stretch>
+                  </pic:blipFill>
+                  <pic:spPr bwMode="auto">
+                    <a:xfrm>
+                      <a:off x="0" y="0"/>
+                      <a:ext cx="5274310" cy="3549015"/>
+                    </a:xfrm>
+                    <a:prstGeom prst="rect">
+                      <a:avLst/>
+                    </a:prstGeom>
+                    <a:noFill/>
+                    <a:ln>
+                      <a:noFill/>
+                    </a:ln>
+                  </pic:spPr>
+                </pic:pic>
+              </a:graphicData>
+            </a:graphic>
+          </wp:inline>
+        </w:drawing>
+      </w:r>
+    </w:p>
+    <w:p>
+      <w:pPr>
         <w:pStyle w:val="acbfdd8b-e11b-4d36-88ff-6049b138f862"/>
         <w:numPr>
           <w:ilvl w:val="0"/>
-          <w:numId w:val="3"/>
+          <w:numId w:val="0"/>
         </w:numPr>
         <w:spacing w:line="240" w:lineRule="auto"/>
         <w:rPr>
-          <w:rFonts w:ascii="Segoe Fluent Icons" w:hAnsi="Segoe Fluent Icons"/>
-          <w:sz w:val="24"/>
-          <w:szCs w:val="24"/>
-        </w:rPr>
-      </w:pPr>
-      <w:r>
-        <w:rPr>
-          <w:rFonts w:ascii="Segoe Fluent Icons" w:hAnsi="Segoe Fluent Icons"/>
-          <w:sz w:val="24"/>
-          <w:szCs w:val="24"/>
-        </w:rPr>
-        <w:t>Manual Add and Import File buttons are available at the bottom.</w:t>
-      </w:r>
-    </w:p>
-    <w:p>
-      <w:pPr>
-        <w:pStyle w:val="71e7dc79-1ff7-45e8-997d-0ebda3762b91"/>
-        <w:rPr>
-          <w:rFonts w:ascii="Segoe Fluent Icons" w:hAnsi="Segoe Fluent Icons"/>
-          <w:sz w:val="24"/>
-          <w:szCs w:val="24"/>
-        </w:rPr>
-      </w:pPr>
-      <w:r>
-        <w:rPr>
-          <w:rFonts w:ascii="Segoe Fluent Icons" w:hAnsi="Segoe Fluent Icons"/>
+          <w:rFonts w:ascii="Times New Roman" w:hAnsi="Times New Roman" w:cs="Times New Roman"/>
+          <w:sz w:val="28"/>
+          <w:szCs w:val="28"/>
+        </w:rPr>
+      </w:pPr>
+      <w:r>
+        <w:rPr>
+          <w:rFonts w:ascii="Times New Roman" w:hAnsi="Times New Roman" w:cs="Times New Roman"/>
           <w:noProof/>
-          <w:sz w:val="24"/>
-          <w:szCs w:val="24"/>
-        </w:rPr>
+          <w:color w:val="0F4761" w:themeColor="accent1" w:themeShade="BF"/>
+          <w:sz w:val="28"/>
+          <w:szCs w:val="28"/>
+        </w:rPr>
+        <w:lastRenderedPageBreak/>
         <w:drawing>
-          <wp:anchor distT="0" distB="0" distL="114300" distR="114300" simplePos="0" relativeHeight="251658240" behindDoc="0" locked="0" layoutInCell="1" allowOverlap="1" wp14:anchorId="781AA6C0" wp14:editId="723BDB52">
+          <wp:anchor distT="0" distB="0" distL="114300" distR="114300" simplePos="0" relativeHeight="251659264" behindDoc="0" locked="0" layoutInCell="1" allowOverlap="1" wp14:anchorId="65CD76BD" wp14:editId="2926CB6E">
+            <wp:simplePos x="1146517" y="4501662"/>
+            <wp:positionH relativeFrom="column">
+              <wp:align>left</wp:align>
+            </wp:positionH>
+            <wp:positionV relativeFrom="paragraph">
+              <wp:align>top</wp:align>
+            </wp:positionV>
+            <wp:extent cx="5274310" cy="3520440"/>
+            <wp:effectExtent l="0" t="0" r="2540" b="3810"/>
+            <wp:wrapSquare wrapText="bothSides"/>
+            <wp:docPr id="397038730" name="图片 1"/>
+            <wp:cNvGraphicFramePr>
+              <a:graphicFrameLocks xmlns:a="http://schemas.openxmlformats.org/drawingml/2006/main" noChangeAspect="1"/>
+            </wp:cNvGraphicFramePr>
+            <a:graphic xmlns:a="http://schemas.openxmlformats.org/drawingml/2006/main">
+              <a:graphicData uri="http://schemas.openxmlformats.org/drawingml/2006/picture">
+                <pic:pic xmlns:pic="http://schemas.openxmlformats.org/drawingml/2006/picture">
+                  <pic:nvPicPr>
+                    <pic:cNvPr id="0" name="Picture 1"/>
+                    <pic:cNvPicPr>
+                      <a:picLocks noChangeAspect="1" noChangeArrowheads="1"/>
+                    </pic:cNvPicPr>
+                  </pic:nvPicPr>
+                  <pic:blipFill>
+                    <a:blip r:embed="rId13" cstate="print">
+                      <a:extLst>
+                        <a:ext uri="{28A0092B-C50C-407E-A947-70E740481C1C}">
+                          <a14:useLocalDpi xmlns:a14="http://schemas.microsoft.com/office/drawing/2010/main" val="0"/>
+                        </a:ext>
+                      </a:extLst>
+                    </a:blip>
+                    <a:srcRect/>
+                    <a:stretch>
+                      <a:fillRect/>
+                    </a:stretch>
+                  </pic:blipFill>
+                  <pic:spPr bwMode="auto">
+                    <a:xfrm>
+                      <a:off x="0" y="0"/>
+                      <a:ext cx="5274310" cy="3520440"/>
+                    </a:xfrm>
+                    <a:prstGeom prst="rect">
+                      <a:avLst/>
+                    </a:prstGeom>
+                    <a:noFill/>
+                    <a:ln>
+                      <a:noFill/>
+                    </a:ln>
+                  </pic:spPr>
+                </pic:pic>
+              </a:graphicData>
+            </a:graphic>
+          </wp:anchor>
+        </w:drawing>
+      </w:r>
+      <w:r>
+        <w:rPr>
+          <w:rFonts w:ascii="Times New Roman" w:hAnsi="Times New Roman" w:cs="Times New Roman"/>
+          <w:noProof/>
+          <w:color w:val="0F4761" w:themeColor="accent1" w:themeShade="BF"/>
+          <w:sz w:val="28"/>
+          <w:szCs w:val="28"/>
+        </w:rPr>
+        <w:drawing>
+          <wp:anchor distT="0" distB="0" distL="114300" distR="114300" simplePos="0" relativeHeight="251658240" behindDoc="0" locked="0" layoutInCell="1" allowOverlap="1" wp14:anchorId="781AA6C0" wp14:editId="3C086566">
             <wp:simplePos x="1143000" y="946150"/>
             <wp:positionH relativeFrom="column">
               <wp:align>left</wp:align>
@@ -505,7 +702,7 @@
                     <pic:cNvPicPr/>
                   </pic:nvPicPr>
                   <pic:blipFill>
-                    <a:blip r:embed="rId12" cstate="print">
+                    <a:blip r:embed="rId14" cstate="print">
                       <a:extLst>
                         <a:ext uri="{28A0092B-C50C-407E-A947-70E740481C1C}">
                           <a14:useLocalDpi xmlns:a14="http://schemas.microsoft.com/office/drawing/2010/main" val="0"/>
@@ -533,35 +730,47 @@
       </w:r>
       <w:r>
         <w:rPr>
-          <w:rFonts w:ascii="Segoe Fluent Icons" w:hAnsi="Segoe Fluent Icons"/>
-          <w:sz w:val="24"/>
-          <w:szCs w:val="24"/>
+          <w:rFonts w:ascii="Times New Roman" w:hAnsi="Times New Roman" w:cs="Times New Roman"/>
+          <w:color w:val="0F4761" w:themeColor="accent1" w:themeShade="BF"/>
+          <w:sz w:val="28"/>
+          <w:szCs w:val="28"/>
         </w:rPr>
         <w:t xml:space="preserve">2.2 </w:t>
       </w:r>
       <w:r>
         <w:rPr>
-          <w:rFonts w:ascii="Segoe Fluent Icons" w:hAnsi="Segoe Fluent Icons"/>
-          <w:sz w:val="24"/>
-          <w:szCs w:val="24"/>
+          <w:rFonts w:ascii="Times New Roman" w:hAnsi="Times New Roman" w:cs="Times New Roman"/>
+          <w:color w:val="0F4761" w:themeColor="accent1" w:themeShade="BF"/>
+          <w:sz w:val="28"/>
+          <w:szCs w:val="28"/>
         </w:rPr>
         <w:t>T</w:t>
       </w:r>
       <w:r>
         <w:rPr>
-          <w:rFonts w:ascii="Segoe Fluent Icons" w:hAnsi="Segoe Fluent Icons"/>
-          <w:sz w:val="24"/>
-          <w:szCs w:val="24"/>
+          <w:rFonts w:ascii="Times New Roman" w:hAnsi="Times New Roman" w:cs="Times New Roman"/>
+          <w:color w:val="0F4761" w:themeColor="accent1" w:themeShade="BF"/>
+          <w:sz w:val="28"/>
+          <w:szCs w:val="28"/>
         </w:rPr>
         <w:t>ransactions</w:t>
       </w:r>
       <w:r>
         <w:rPr>
-          <w:rFonts w:ascii="Segoe Fluent Icons" w:hAnsi="Segoe Fluent Icons"/>
-          <w:sz w:val="24"/>
-          <w:szCs w:val="24"/>
-        </w:rPr>
-        <w:t xml:space="preserve"> Module </w:t>
+          <w:rFonts w:ascii="Times New Roman" w:hAnsi="Times New Roman" w:cs="Times New Roman"/>
+          <w:color w:val="0F4761" w:themeColor="accent1" w:themeShade="BF"/>
+          <w:sz w:val="28"/>
+          <w:szCs w:val="28"/>
+        </w:rPr>
+        <w:t xml:space="preserve"> Module</w:t>
+      </w:r>
+      <w:r>
+        <w:rPr>
+          <w:rFonts w:ascii="Times New Roman" w:hAnsi="Times New Roman" w:cs="Times New Roman"/>
+          <w:sz w:val="28"/>
+          <w:szCs w:val="28"/>
+        </w:rPr>
+        <w:t xml:space="preserve"> </w:t>
       </w:r>
     </w:p>
     <w:p>
@@ -572,14 +781,14 @@
           <w:numId w:val="4"/>
         </w:numPr>
         <w:rPr>
-          <w:rFonts w:ascii="Segoe Fluent Icons" w:hAnsi="Segoe Fluent Icons"/>
-          <w:sz w:val="24"/>
-          <w:szCs w:val="24"/>
-        </w:rPr>
-      </w:pPr>
-      <w:r>
-        <w:rPr>
-          <w:rFonts w:ascii="Segoe Fluent Icons" w:hAnsi="Segoe Fluent Icons"/>
+          <w:rFonts w:ascii="Times New Roman" w:hAnsi="Times New Roman" w:cs="Times New Roman"/>
+          <w:sz w:val="24"/>
+          <w:szCs w:val="24"/>
+        </w:rPr>
+      </w:pPr>
+      <w:r>
+        <w:rPr>
+          <w:rFonts w:ascii="Times New Roman" w:hAnsi="Times New Roman" w:cs="Times New Roman"/>
           <w:sz w:val="24"/>
           <w:szCs w:val="24"/>
         </w:rPr>
@@ -588,7 +797,7 @@
       <w:proofErr w:type="gramStart"/>
       <w:r>
         <w:rPr>
-          <w:rFonts w:ascii="Segoe Fluent Icons" w:hAnsi="Segoe Fluent Icons"/>
+          <w:rFonts w:ascii="Times New Roman" w:hAnsi="Times New Roman" w:cs="Times New Roman"/>
           <w:sz w:val="24"/>
           <w:szCs w:val="24"/>
         </w:rPr>
@@ -597,7 +806,7 @@
       <w:proofErr w:type="gramEnd"/>
       <w:r>
         <w:rPr>
-          <w:rFonts w:ascii="Segoe Fluent Icons" w:hAnsi="Segoe Fluent Icons"/>
+          <w:rFonts w:ascii="Times New Roman" w:hAnsi="Times New Roman" w:cs="Times New Roman"/>
           <w:sz w:val="24"/>
           <w:szCs w:val="24"/>
         </w:rPr>
@@ -606,7 +815,7 @@
       <w:proofErr w:type="gramStart"/>
       <w:r>
         <w:rPr>
-          <w:rFonts w:ascii="Segoe Fluent Icons" w:hAnsi="Segoe Fluent Icons"/>
+          <w:rFonts w:ascii="Times New Roman" w:hAnsi="Times New Roman" w:cs="Times New Roman"/>
           <w:sz w:val="24"/>
           <w:szCs w:val="24"/>
         </w:rPr>
@@ -615,7 +824,7 @@
       <w:proofErr w:type="gramEnd"/>
       <w:r>
         <w:rPr>
-          <w:rFonts w:ascii="Segoe Fluent Icons" w:hAnsi="Segoe Fluent Icons"/>
+          <w:rFonts w:ascii="Times New Roman" w:hAnsi="Times New Roman" w:cs="Times New Roman"/>
           <w:sz w:val="24"/>
           <w:szCs w:val="24"/>
         </w:rPr>
@@ -624,7 +833,7 @@
       <w:proofErr w:type="gramStart"/>
       <w:r>
         <w:rPr>
-          <w:rFonts w:ascii="Segoe Fluent Icons" w:hAnsi="Segoe Fluent Icons"/>
+          <w:rFonts w:ascii="Times New Roman" w:hAnsi="Times New Roman" w:cs="Times New Roman"/>
           <w:sz w:val="24"/>
           <w:szCs w:val="24"/>
         </w:rPr>
@@ -633,21 +842,12 @@
       <w:proofErr w:type="gramEnd"/>
       <w:r>
         <w:rPr>
-          <w:rFonts w:ascii="Segoe Fluent Icons" w:hAnsi="Segoe Fluent Icons"/>
+          <w:rFonts w:ascii="Times New Roman" w:hAnsi="Times New Roman" w:cs="Times New Roman"/>
           <w:sz w:val="24"/>
           <w:szCs w:val="24"/>
         </w:rPr>
         <w:t xml:space="preserve"> only expenses)</w:t>
       </w:r>
-    </w:p>
-    <w:p>
-      <w:pPr>
-        <w:rPr>
-          <w:rFonts w:ascii="Segoe Fluent Icons" w:hAnsi="Segoe Fluent Icons"/>
-          <w:sz w:val="24"/>
-          <w:szCs w:val="24"/>
-        </w:rPr>
-      </w:pPr>
     </w:p>
     <w:p>
       <w:pPr>
@@ -657,14 +857,14 @@
           <w:numId w:val="4"/>
         </w:numPr>
         <w:rPr>
-          <w:rFonts w:ascii="Segoe Fluent Icons" w:hAnsi="Segoe Fluent Icons"/>
-          <w:sz w:val="24"/>
-          <w:szCs w:val="24"/>
-        </w:rPr>
-      </w:pPr>
-      <w:r>
-        <w:rPr>
-          <w:rFonts w:ascii="Segoe Fluent Icons" w:hAnsi="Segoe Fluent Icons"/>
+          <w:rFonts w:ascii="Times New Roman" w:hAnsi="Times New Roman" w:cs="Times New Roman"/>
+          <w:sz w:val="24"/>
+          <w:szCs w:val="24"/>
+        </w:rPr>
+      </w:pPr>
+      <w:r>
+        <w:rPr>
+          <w:rFonts w:ascii="Times New Roman" w:hAnsi="Times New Roman" w:cs="Times New Roman"/>
           <w:sz w:val="24"/>
           <w:szCs w:val="24"/>
         </w:rPr>
@@ -674,32 +874,22 @@
     <w:p>
       <w:pPr>
         <w:rPr>
-          <w:rFonts w:ascii="Segoe Fluent Icons" w:hAnsi="Segoe Fluent Icons"/>
-          <w:sz w:val="24"/>
-          <w:szCs w:val="24"/>
-        </w:rPr>
-      </w:pPr>
-    </w:p>
-    <w:p>
-      <w:pPr>
-        <w:rPr>
-          <w:rFonts w:ascii="Segoe Fluent Icons" w:hAnsi="Segoe Fluent Icons"/>
-          <w:sz w:val="24"/>
-          <w:szCs w:val="24"/>
-        </w:rPr>
-      </w:pPr>
-      <w:r>
-        <w:rPr>
-          <w:rFonts w:ascii="Segoe Fluent Icons" w:hAnsi="Segoe Fluent Icons"/>
-          <w:noProof/>
+          <w:rFonts w:ascii="Times New Roman" w:hAnsi="Times New Roman" w:cs="Times New Roman"/>
+          <w:sz w:val="24"/>
+          <w:szCs w:val="24"/>
+        </w:rPr>
+      </w:pPr>
+      <w:r>
+        <w:rPr>
+          <w:rFonts w:ascii="Times New Roman" w:hAnsi="Times New Roman" w:cs="Times New Roman"/>
           <w:sz w:val="24"/>
           <w:szCs w:val="24"/>
         </w:rPr>
         <w:drawing>
-          <wp:inline distT="0" distB="0" distL="0" distR="0" wp14:anchorId="7A483E76" wp14:editId="10C02F4B">
-            <wp:extent cx="5274310" cy="3514090"/>
-            <wp:effectExtent l="0" t="0" r="2540" b="0"/>
-            <wp:docPr id="598781758" name="图片 1"/>
+          <wp:inline distT="0" distB="0" distL="0" distR="0" wp14:anchorId="7DCDBAD8" wp14:editId="242A2B2D">
+            <wp:extent cx="5274310" cy="3554730"/>
+            <wp:effectExtent l="0" t="0" r="2540" b="7620"/>
+            <wp:docPr id="401635062" name="图片 1"/>
             <wp:cNvGraphicFramePr>
               <a:graphicFrameLocks xmlns:a="http://schemas.openxmlformats.org/drawingml/2006/main" noChangeAspect="1"/>
             </wp:cNvGraphicFramePr>
@@ -707,11 +897,11 @@
               <a:graphicData uri="http://schemas.openxmlformats.org/drawingml/2006/picture">
                 <pic:pic xmlns:pic="http://schemas.openxmlformats.org/drawingml/2006/picture">
                   <pic:nvPicPr>
-                    <pic:cNvPr id="598781758" name=""/>
+                    <pic:cNvPr id="401635062" name=""/>
                     <pic:cNvPicPr/>
                   </pic:nvPicPr>
                   <pic:blipFill>
-                    <a:blip r:embed="rId13"/>
+                    <a:blip r:embed="rId15"/>
                     <a:stretch>
                       <a:fillRect/>
                     </a:stretch>
@@ -719,7 +909,7 @@
                   <pic:spPr>
                     <a:xfrm>
                       <a:off x="0" y="0"/>
-                      <a:ext cx="5274310" cy="3514090"/>
+                      <a:ext cx="5274310" cy="3554730"/>
                     </a:xfrm>
                     <a:prstGeom prst="rect">
                       <a:avLst/>
@@ -736,17 +926,20 @@
       <w:pPr>
         <w:pStyle w:val="71e7dc79-1ff7-45e8-997d-0ebda3762b91"/>
         <w:rPr>
-          <w:rFonts w:ascii="Segoe Fluent Icons" w:hAnsi="Segoe Fluent Icons"/>
-          <w:sz w:val="24"/>
-          <w:szCs w:val="24"/>
-        </w:rPr>
-      </w:pPr>
-      <w:r>
-        <w:rPr>
-          <w:rFonts w:ascii="Segoe Fluent Icons" w:hAnsi="Segoe Fluent Icons"/>
-          <w:sz w:val="24"/>
-          <w:szCs w:val="24"/>
-        </w:rPr>
+          <w:rFonts w:ascii="Times New Roman" w:hAnsi="Times New Roman" w:cs="Times New Roman"/>
+          <w:b w:val="0"/>
+          <w:color w:val="0F4761" w:themeColor="accent1" w:themeShade="BF"/>
+          <w:szCs w:val="28"/>
+        </w:rPr>
+      </w:pPr>
+      <w:r>
+        <w:rPr>
+          <w:rFonts w:ascii="Times New Roman" w:hAnsi="Times New Roman" w:cs="Times New Roman"/>
+          <w:b w:val="0"/>
+          <w:color w:val="0F4761" w:themeColor="accent1" w:themeShade="BF"/>
+          <w:szCs w:val="28"/>
+        </w:rPr>
+        <w:lastRenderedPageBreak/>
         <w:t>2.3 Account Information Module</w:t>
       </w:r>
     </w:p>
@@ -759,14 +952,14 @@
         </w:numPr>
         <w:spacing w:line="240" w:lineRule="auto"/>
         <w:rPr>
-          <w:rFonts w:ascii="Segoe Fluent Icons" w:hAnsi="Segoe Fluent Icons"/>
-          <w:sz w:val="24"/>
-          <w:szCs w:val="24"/>
-        </w:rPr>
-      </w:pPr>
-      <w:r>
-        <w:rPr>
-          <w:rFonts w:ascii="Segoe Fluent Icons" w:hAnsi="Segoe Fluent Icons"/>
+          <w:rFonts w:ascii="Times New Roman" w:hAnsi="Times New Roman" w:cs="Times New Roman"/>
+          <w:sz w:val="24"/>
+          <w:szCs w:val="24"/>
+        </w:rPr>
+      </w:pPr>
+      <w:r>
+        <w:rPr>
+          <w:rFonts w:ascii="Times New Roman" w:hAnsi="Times New Roman" w:cs="Times New Roman"/>
           <w:sz w:val="24"/>
           <w:szCs w:val="24"/>
         </w:rPr>
@@ -774,7 +967,7 @@
       </w:r>
       <w:r>
         <w:rPr>
-          <w:rFonts w:ascii="Segoe Fluent Icons" w:hAnsi="Segoe Fluent Icons"/>
+          <w:rFonts w:ascii="Times New Roman" w:hAnsi="Times New Roman" w:cs="Times New Roman"/>
           <w:sz w:val="24"/>
           <w:szCs w:val="24"/>
         </w:rPr>
@@ -790,14 +983,14 @@
         </w:numPr>
         <w:spacing w:line="240" w:lineRule="auto"/>
         <w:rPr>
-          <w:rFonts w:ascii="Segoe Fluent Icons" w:hAnsi="Segoe Fluent Icons"/>
-          <w:sz w:val="24"/>
-          <w:szCs w:val="24"/>
-        </w:rPr>
-      </w:pPr>
-      <w:r>
-        <w:rPr>
-          <w:rFonts w:ascii="Segoe Fluent Icons" w:hAnsi="Segoe Fluent Icons"/>
+          <w:rFonts w:ascii="Times New Roman" w:hAnsi="Times New Roman" w:cs="Times New Roman"/>
+          <w:sz w:val="24"/>
+          <w:szCs w:val="24"/>
+        </w:rPr>
+      </w:pPr>
+      <w:r>
+        <w:rPr>
+          <w:rFonts w:ascii="Times New Roman" w:hAnsi="Times New Roman" w:cs="Times New Roman"/>
           <w:sz w:val="24"/>
           <w:szCs w:val="24"/>
         </w:rPr>
@@ -813,14 +1006,14 @@
         </w:numPr>
         <w:spacing w:line="240" w:lineRule="auto"/>
         <w:rPr>
-          <w:rFonts w:ascii="Segoe Fluent Icons" w:hAnsi="Segoe Fluent Icons"/>
-          <w:sz w:val="24"/>
-          <w:szCs w:val="24"/>
-        </w:rPr>
-      </w:pPr>
-      <w:r>
-        <w:rPr>
-          <w:rFonts w:ascii="Segoe Fluent Icons" w:hAnsi="Segoe Fluent Icons"/>
+          <w:rFonts w:ascii="Times New Roman" w:hAnsi="Times New Roman" w:cs="Times New Roman"/>
+          <w:sz w:val="24"/>
+          <w:szCs w:val="24"/>
+        </w:rPr>
+      </w:pPr>
+      <w:r>
+        <w:rPr>
+          <w:rFonts w:ascii="Times New Roman" w:hAnsi="Times New Roman" w:cs="Times New Roman"/>
           <w:sz w:val="24"/>
           <w:szCs w:val="24"/>
         </w:rPr>
@@ -830,23 +1023,22 @@
     <w:p>
       <w:pPr>
         <w:rPr>
-          <w:rFonts w:ascii="Segoe Fluent Icons" w:hAnsi="Segoe Fluent Icons"/>
-          <w:sz w:val="24"/>
-          <w:szCs w:val="24"/>
-        </w:rPr>
-      </w:pPr>
-      <w:r>
-        <w:rPr>
-          <w:rFonts w:ascii="Segoe Fluent Icons" w:hAnsi="Segoe Fluent Icons"/>
-          <w:noProof/>
+          <w:rFonts w:ascii="Times New Roman" w:hAnsi="Times New Roman" w:cs="Times New Roman"/>
+          <w:sz w:val="24"/>
+          <w:szCs w:val="24"/>
+        </w:rPr>
+      </w:pPr>
+      <w:r>
+        <w:rPr>
+          <w:rFonts w:ascii="Times New Roman" w:hAnsi="Times New Roman" w:cs="Times New Roman"/>
           <w:sz w:val="24"/>
           <w:szCs w:val="24"/>
         </w:rPr>
         <w:drawing>
-          <wp:inline distT="0" distB="0" distL="0" distR="0" wp14:anchorId="23911CC9" wp14:editId="0FEC2B0A">
-            <wp:extent cx="5274310" cy="3529965"/>
-            <wp:effectExtent l="0" t="0" r="2540" b="0"/>
-            <wp:docPr id="1175220130" name="图片 2" descr="用户上传的图片"/>
+          <wp:inline distT="0" distB="0" distL="0" distR="0" wp14:anchorId="0592976E" wp14:editId="6A72008D">
+            <wp:extent cx="5274310" cy="3533775"/>
+            <wp:effectExtent l="0" t="0" r="2540" b="9525"/>
+            <wp:docPr id="1756882857" name="图片 1"/>
             <wp:cNvGraphicFramePr>
               <a:graphicFrameLocks xmlns:a="http://schemas.openxmlformats.org/drawingml/2006/main" noChangeAspect="1"/>
             </wp:cNvGraphicFramePr>
@@ -854,13 +1046,803 @@
               <a:graphicData uri="http://schemas.openxmlformats.org/drawingml/2006/picture">
                 <pic:pic xmlns:pic="http://schemas.openxmlformats.org/drawingml/2006/picture">
                   <pic:nvPicPr>
-                    <pic:cNvPr id="0" name="Picture 3" descr="用户上传的图片"/>
+                    <pic:cNvPr id="1756882857" name=""/>
+                    <pic:cNvPicPr/>
+                  </pic:nvPicPr>
+                  <pic:blipFill>
+                    <a:blip r:embed="rId16"/>
+                    <a:stretch>
+                      <a:fillRect/>
+                    </a:stretch>
+                  </pic:blipFill>
+                  <pic:spPr>
+                    <a:xfrm>
+                      <a:off x="0" y="0"/>
+                      <a:ext cx="5274310" cy="3533775"/>
+                    </a:xfrm>
+                    <a:prstGeom prst="rect">
+                      <a:avLst/>
+                    </a:prstGeom>
+                  </pic:spPr>
+                </pic:pic>
+              </a:graphicData>
+            </a:graphic>
+          </wp:inline>
+        </w:drawing>
+      </w:r>
+    </w:p>
+    <w:p>
+      <w:pPr>
+        <w:pStyle w:val="71e7dc79-1ff7-45e8-997d-0ebda3762b91"/>
+        <w:rPr>
+          <w:rFonts w:ascii="Times New Roman" w:hAnsi="Times New Roman" w:cs="Times New Roman"/>
+          <w:b w:val="0"/>
+          <w:color w:val="0F4761" w:themeColor="accent1" w:themeShade="BF"/>
+          <w:szCs w:val="28"/>
+        </w:rPr>
+      </w:pPr>
+      <w:r>
+        <w:rPr>
+          <w:rFonts w:ascii="Times New Roman" w:hAnsi="Times New Roman" w:cs="Times New Roman"/>
+          <w:b w:val="0"/>
+          <w:color w:val="0F4761" w:themeColor="accent1" w:themeShade="BF"/>
+          <w:szCs w:val="28"/>
+        </w:rPr>
+        <w:t>2.4 Analysis of consumption trend</w:t>
+      </w:r>
+    </w:p>
+    <w:p>
+      <w:pPr>
+        <w:pStyle w:val="acbfdd8b-e11b-4d36-88ff-6049b138f862"/>
+        <w:numPr>
+          <w:ilvl w:val="0"/>
+          <w:numId w:val="6"/>
+        </w:numPr>
+        <w:rPr>
+          <w:rFonts w:ascii="Times New Roman" w:hAnsi="Times New Roman" w:cs="Times New Roman"/>
+          <w:sz w:val="24"/>
+          <w:szCs w:val="24"/>
+        </w:rPr>
+      </w:pPr>
+      <w:r>
+        <w:rPr>
+          <w:rFonts w:ascii="Times New Roman" w:hAnsi="Times New Roman" w:cs="Times New Roman"/>
+          <w:sz w:val="24"/>
+          <w:szCs w:val="24"/>
+        </w:rPr>
+        <w:t>Display annual income and expenditure trends and monthly income and expenditure trends.</w:t>
+      </w:r>
+    </w:p>
+    <w:p>
+      <w:pPr>
+        <w:pStyle w:val="acbfdd8b-e11b-4d36-88ff-6049b138f862"/>
+        <w:numPr>
+          <w:ilvl w:val="0"/>
+          <w:numId w:val="6"/>
+        </w:numPr>
+        <w:rPr>
+          <w:rFonts w:ascii="Times New Roman" w:hAnsi="Times New Roman" w:cs="Times New Roman"/>
+          <w:sz w:val="24"/>
+          <w:szCs w:val="24"/>
+        </w:rPr>
+      </w:pPr>
+      <w:r>
+        <w:rPr>
+          <w:rFonts w:ascii="Times New Roman" w:hAnsi="Times New Roman" w:cs="Times New Roman"/>
+          <w:sz w:val="24"/>
+          <w:szCs w:val="24"/>
+        </w:rPr>
+        <w:t>Textual summary of AI analysis results</w:t>
+      </w:r>
+    </w:p>
+    <w:p>
+      <w:pPr>
+        <w:rPr>
+          <w:rFonts w:ascii="Times New Roman" w:hAnsi="Times New Roman" w:cs="Times New Roman"/>
+          <w:sz w:val="24"/>
+          <w:szCs w:val="24"/>
+        </w:rPr>
+      </w:pPr>
+      <w:r>
+        <w:rPr>
+          <w:rFonts w:ascii="Times New Roman" w:hAnsi="Times New Roman" w:cs="Times New Roman"/>
+          <w:sz w:val="24"/>
+          <w:szCs w:val="24"/>
+        </w:rPr>
+        <w:lastRenderedPageBreak/>
+        <w:drawing>
+          <wp:inline distT="0" distB="0" distL="0" distR="0" wp14:anchorId="7E2EA4A1" wp14:editId="7236AADA">
+            <wp:extent cx="5274310" cy="3536950"/>
+            <wp:effectExtent l="0" t="0" r="2540" b="6350"/>
+            <wp:docPr id="449624258" name="图片 1"/>
+            <wp:cNvGraphicFramePr>
+              <a:graphicFrameLocks xmlns:a="http://schemas.openxmlformats.org/drawingml/2006/main" noChangeAspect="1"/>
+            </wp:cNvGraphicFramePr>
+            <a:graphic xmlns:a="http://schemas.openxmlformats.org/drawingml/2006/main">
+              <a:graphicData uri="http://schemas.openxmlformats.org/drawingml/2006/picture">
+                <pic:pic xmlns:pic="http://schemas.openxmlformats.org/drawingml/2006/picture">
+                  <pic:nvPicPr>
+                    <pic:cNvPr id="449624258" name=""/>
+                    <pic:cNvPicPr/>
+                  </pic:nvPicPr>
+                  <pic:blipFill>
+                    <a:blip r:embed="rId17"/>
+                    <a:stretch>
+                      <a:fillRect/>
+                    </a:stretch>
+                  </pic:blipFill>
+                  <pic:spPr>
+                    <a:xfrm>
+                      <a:off x="0" y="0"/>
+                      <a:ext cx="5274310" cy="3536950"/>
+                    </a:xfrm>
+                    <a:prstGeom prst="rect">
+                      <a:avLst/>
+                    </a:prstGeom>
+                  </pic:spPr>
+                </pic:pic>
+              </a:graphicData>
+            </a:graphic>
+          </wp:inline>
+        </w:drawing>
+      </w:r>
+    </w:p>
+    <w:p>
+      <w:pPr>
+        <w:pStyle w:val="acbfdd8b-e11b-4d36-88ff-6049b138f862"/>
+        <w:numPr>
+          <w:ilvl w:val="0"/>
+          <w:numId w:val="6"/>
+        </w:numPr>
+        <w:rPr>
+          <w:rFonts w:ascii="Times New Roman" w:hAnsi="Times New Roman" w:cs="Times New Roman"/>
+          <w:sz w:val="24"/>
+          <w:szCs w:val="24"/>
+        </w:rPr>
+      </w:pPr>
+      <w:r>
+        <w:rPr>
+          <w:rFonts w:ascii="Times New Roman" w:hAnsi="Times New Roman" w:cs="Times New Roman"/>
+          <w:sz w:val="24"/>
+          <w:szCs w:val="24"/>
+        </w:rPr>
+        <w:t>Provide Generate Report button to generate report</w:t>
+      </w:r>
+    </w:p>
+    <w:p>
+      <w:pPr>
+        <w:rPr>
+          <w:rFonts w:ascii="Times New Roman" w:hAnsi="Times New Roman" w:cs="Times New Roman"/>
+          <w:sz w:val="24"/>
+          <w:szCs w:val="24"/>
+        </w:rPr>
+      </w:pPr>
+      <w:r>
+        <w:rPr>
+          <w:rFonts w:ascii="Times New Roman" w:hAnsi="Times New Roman" w:cs="Times New Roman"/>
+          <w:sz w:val="24"/>
+          <w:szCs w:val="24"/>
+        </w:rPr>
+        <w:drawing>
+          <wp:inline distT="0" distB="0" distL="0" distR="0" wp14:anchorId="704273FE" wp14:editId="7EB83551">
+            <wp:extent cx="5274310" cy="3575050"/>
+            <wp:effectExtent l="0" t="0" r="2540" b="6350"/>
+            <wp:docPr id="1887133310" name="图片 1"/>
+            <wp:cNvGraphicFramePr>
+              <a:graphicFrameLocks xmlns:a="http://schemas.openxmlformats.org/drawingml/2006/main" noChangeAspect="1"/>
+            </wp:cNvGraphicFramePr>
+            <a:graphic xmlns:a="http://schemas.openxmlformats.org/drawingml/2006/main">
+              <a:graphicData uri="http://schemas.openxmlformats.org/drawingml/2006/picture">
+                <pic:pic xmlns:pic="http://schemas.openxmlformats.org/drawingml/2006/picture">
+                  <pic:nvPicPr>
+                    <pic:cNvPr id="1887133310" name=""/>
+                    <pic:cNvPicPr/>
+                  </pic:nvPicPr>
+                  <pic:blipFill>
+                    <a:blip r:embed="rId18"/>
+                    <a:stretch>
+                      <a:fillRect/>
+                    </a:stretch>
+                  </pic:blipFill>
+                  <pic:spPr>
+                    <a:xfrm>
+                      <a:off x="0" y="0"/>
+                      <a:ext cx="5274310" cy="3575050"/>
+                    </a:xfrm>
+                    <a:prstGeom prst="rect">
+                      <a:avLst/>
+                    </a:prstGeom>
+                  </pic:spPr>
+                </pic:pic>
+              </a:graphicData>
+            </a:graphic>
+          </wp:inline>
+        </w:drawing>
+      </w:r>
+    </w:p>
+    <w:p>
+      <w:pPr>
+        <w:pStyle w:val="71e7dc79-1ff7-45e8-997d-0ebda3762b91"/>
+        <w:spacing w:line="240" w:lineRule="auto"/>
+        <w:rPr>
+          <w:rFonts w:ascii="Times New Roman" w:hAnsi="Times New Roman" w:cs="Times New Roman"/>
+          <w:b w:val="0"/>
+          <w:color w:val="0F4761" w:themeColor="accent1" w:themeShade="BF"/>
+          <w:szCs w:val="28"/>
+        </w:rPr>
+      </w:pPr>
+      <w:r>
+        <w:rPr>
+          <w:rFonts w:ascii="Times New Roman" w:hAnsi="Times New Roman" w:cs="Times New Roman"/>
+          <w:b w:val="0"/>
+          <w:color w:val="0F4761" w:themeColor="accent1" w:themeShade="BF"/>
+          <w:szCs w:val="28"/>
+        </w:rPr>
+        <w:t>2.5 Credit Card Management</w:t>
+      </w:r>
+    </w:p>
+    <w:p>
+      <w:pPr>
+        <w:pStyle w:val="a9"/>
+        <w:numPr>
+          <w:ilvl w:val="0"/>
+          <w:numId w:val="7"/>
+        </w:numPr>
+        <w:rPr>
+          <w:rFonts w:ascii="Times New Roman" w:hAnsi="Times New Roman" w:cs="Times New Roman"/>
+          <w:sz w:val="24"/>
+          <w:szCs w:val="24"/>
+        </w:rPr>
+      </w:pPr>
+      <w:r>
+        <w:rPr>
+          <w:rFonts w:ascii="Times New Roman" w:hAnsi="Times New Roman" w:cs="Times New Roman"/>
+          <w:sz w:val="24"/>
+          <w:szCs w:val="24"/>
+        </w:rPr>
+        <w:t>On the left side is a list of card information (type, bank, card number, cardholder) and on the right side is a pie chart of card account statistics.</w:t>
+      </w:r>
+    </w:p>
+    <w:p>
+      <w:pPr>
+        <w:pStyle w:val="a9"/>
+        <w:numPr>
+          <w:ilvl w:val="0"/>
+          <w:numId w:val="7"/>
+        </w:numPr>
+        <w:rPr>
+          <w:rFonts w:ascii="Times New Roman" w:hAnsi="Times New Roman" w:cs="Times New Roman"/>
+          <w:sz w:val="24"/>
+          <w:szCs w:val="24"/>
+        </w:rPr>
+      </w:pPr>
+      <w:r>
+        <w:rPr>
+          <w:rFonts w:ascii="Times New Roman" w:hAnsi="Times New Roman" w:cs="Times New Roman"/>
+          <w:sz w:val="24"/>
+          <w:szCs w:val="24"/>
+        </w:rPr>
+        <w:t>The lower form supports adding new cards, which requires filling in the card type, card number, cardholder name, and expiration time.</w:t>
+      </w:r>
+    </w:p>
+    <w:p>
+      <w:pPr>
+        <w:rPr>
+          <w:rFonts w:ascii="Times New Roman" w:hAnsi="Times New Roman" w:cs="Times New Roman"/>
+          <w:sz w:val="24"/>
+          <w:szCs w:val="24"/>
+        </w:rPr>
+      </w:pPr>
+    </w:p>
+    <w:p>
+      <w:pPr>
+        <w:rPr>
+          <w:rFonts w:ascii="Times New Roman" w:hAnsi="Times New Roman" w:cs="Times New Roman" w:hint="eastAsia"/>
+          <w:sz w:val="24"/>
+          <w:szCs w:val="24"/>
+        </w:rPr>
+      </w:pPr>
+      <w:r>
+        <w:rPr>
+          <w:rFonts w:ascii="Times New Roman" w:hAnsi="Times New Roman" w:cs="Times New Roman"/>
+          <w:sz w:val="24"/>
+          <w:szCs w:val="24"/>
+        </w:rPr>
+        <w:drawing>
+          <wp:inline distT="0" distB="0" distL="0" distR="0" wp14:anchorId="2BDC01F6" wp14:editId="3A7AC686">
+            <wp:extent cx="5274310" cy="3524885"/>
+            <wp:effectExtent l="0" t="0" r="2540" b="0"/>
+            <wp:docPr id="286514507" name="图片 1"/>
+            <wp:cNvGraphicFramePr>
+              <a:graphicFrameLocks xmlns:a="http://schemas.openxmlformats.org/drawingml/2006/main" noChangeAspect="1"/>
+            </wp:cNvGraphicFramePr>
+            <a:graphic xmlns:a="http://schemas.openxmlformats.org/drawingml/2006/main">
+              <a:graphicData uri="http://schemas.openxmlformats.org/drawingml/2006/picture">
+                <pic:pic xmlns:pic="http://schemas.openxmlformats.org/drawingml/2006/picture">
+                  <pic:nvPicPr>
+                    <pic:cNvPr id="286514507" name=""/>
+                    <pic:cNvPicPr/>
+                  </pic:nvPicPr>
+                  <pic:blipFill>
+                    <a:blip r:embed="rId19"/>
+                    <a:stretch>
+                      <a:fillRect/>
+                    </a:stretch>
+                  </pic:blipFill>
+                  <pic:spPr>
+                    <a:xfrm>
+                      <a:off x="0" y="0"/>
+                      <a:ext cx="5274310" cy="3524885"/>
+                    </a:xfrm>
+                    <a:prstGeom prst="rect">
+                      <a:avLst/>
+                    </a:prstGeom>
+                  </pic:spPr>
+                </pic:pic>
+              </a:graphicData>
+            </a:graphic>
+          </wp:inline>
+        </w:drawing>
+      </w:r>
+    </w:p>
+    <w:p>
+      <w:pPr>
+        <w:pStyle w:val="71e7dc79-1ff7-45e8-997d-0ebda3762b91"/>
+        <w:rPr>
+          <w:rFonts w:ascii="Times New Roman" w:hAnsi="Times New Roman" w:cs="Times New Roman"/>
+          <w:b w:val="0"/>
+          <w:color w:val="0F4761" w:themeColor="accent1" w:themeShade="BF"/>
+          <w:szCs w:val="28"/>
+        </w:rPr>
+      </w:pPr>
+      <w:r>
+        <w:rPr>
+          <w:rFonts w:ascii="Times New Roman" w:hAnsi="Times New Roman" w:cs="Times New Roman"/>
+          <w:b w:val="0"/>
+          <w:color w:val="0F4761" w:themeColor="accent1" w:themeShade="BF"/>
+          <w:szCs w:val="28"/>
+        </w:rPr>
+        <w:t>2.6 Setup Page</w:t>
+      </w:r>
+    </w:p>
+    <w:p>
+      <w:pPr>
+        <w:pStyle w:val="acbfdd8b-e11b-4d36-88ff-6049b138f862"/>
+        <w:numPr>
+          <w:ilvl w:val="0"/>
+          <w:numId w:val="9"/>
+        </w:numPr>
+        <w:rPr>
+          <w:rFonts w:ascii="Times New Roman" w:hAnsi="Times New Roman" w:cs="Times New Roman"/>
+          <w:sz w:val="24"/>
+          <w:szCs w:val="24"/>
+        </w:rPr>
+      </w:pPr>
+      <w:r>
+        <w:rPr>
+          <w:rFonts w:ascii="Times New Roman" w:hAnsi="Times New Roman" w:cs="Times New Roman"/>
+          <w:sz w:val="24"/>
+          <w:szCs w:val="24"/>
+        </w:rPr>
+        <w:t>The Profile page allows users to view and modify personal information such as name, email and date of birth.</w:t>
+      </w:r>
+    </w:p>
+    <w:p>
+      <w:pPr>
+        <w:rPr>
+          <w:rFonts w:ascii="Times New Roman" w:hAnsi="Times New Roman" w:cs="Times New Roman"/>
+          <w:sz w:val="24"/>
+          <w:szCs w:val="24"/>
+        </w:rPr>
+      </w:pPr>
+      <w:r>
+        <w:rPr>
+          <w:rFonts w:ascii="Times New Roman" w:hAnsi="Times New Roman" w:cs="Times New Roman"/>
+          <w:sz w:val="24"/>
+          <w:szCs w:val="24"/>
+        </w:rPr>
+        <w:drawing>
+          <wp:inline distT="0" distB="0" distL="0" distR="0" wp14:anchorId="1EDA9F40" wp14:editId="72C1F912">
+            <wp:extent cx="5274310" cy="3548380"/>
+            <wp:effectExtent l="0" t="0" r="2540" b="0"/>
+            <wp:docPr id="90087425" name="图片 1"/>
+            <wp:cNvGraphicFramePr>
+              <a:graphicFrameLocks xmlns:a="http://schemas.openxmlformats.org/drawingml/2006/main" noChangeAspect="1"/>
+            </wp:cNvGraphicFramePr>
+            <a:graphic xmlns:a="http://schemas.openxmlformats.org/drawingml/2006/main">
+              <a:graphicData uri="http://schemas.openxmlformats.org/drawingml/2006/picture">
+                <pic:pic xmlns:pic="http://schemas.openxmlformats.org/drawingml/2006/picture">
+                  <pic:nvPicPr>
+                    <pic:cNvPr id="90087425" name=""/>
+                    <pic:cNvPicPr/>
+                  </pic:nvPicPr>
+                  <pic:blipFill>
+                    <a:blip r:embed="rId20"/>
+                    <a:stretch>
+                      <a:fillRect/>
+                    </a:stretch>
+                  </pic:blipFill>
+                  <pic:spPr>
+                    <a:xfrm>
+                      <a:off x="0" y="0"/>
+                      <a:ext cx="5274310" cy="3548380"/>
+                    </a:xfrm>
+                    <a:prstGeom prst="rect">
+                      <a:avLst/>
+                    </a:prstGeom>
+                  </pic:spPr>
+                </pic:pic>
+              </a:graphicData>
+            </a:graphic>
+          </wp:inline>
+        </w:drawing>
+      </w:r>
+    </w:p>
+    <w:p>
+      <w:pPr>
+        <w:pStyle w:val="a9"/>
+        <w:numPr>
+          <w:ilvl w:val="0"/>
+          <w:numId w:val="9"/>
+        </w:numPr>
+        <w:ind w:left="442" w:hanging="442"/>
+        <w:rPr>
+          <w:rFonts w:ascii="Times New Roman" w:hAnsi="Times New Roman" w:cs="Times New Roman"/>
+          <w:sz w:val="24"/>
+          <w:szCs w:val="24"/>
+        </w:rPr>
+      </w:pPr>
+      <w:r>
+        <w:rPr>
+          <w:rFonts w:ascii="Times New Roman" w:hAnsi="Times New Roman" w:cs="Times New Roman"/>
+          <w:sz w:val="24"/>
+          <w:szCs w:val="24"/>
+        </w:rPr>
+        <w:t xml:space="preserve">The Preferences page provides options for preferences such as currency, time zone, notifications, and budget </w:t>
+      </w:r>
+      <w:proofErr w:type="spellStart"/>
+      <w:r>
+        <w:rPr>
+          <w:rFonts w:ascii="Times New Roman" w:hAnsi="Times New Roman" w:cs="Times New Roman"/>
+          <w:sz w:val="24"/>
+          <w:szCs w:val="24"/>
+        </w:rPr>
+        <w:t>limitis</w:t>
+      </w:r>
+      <w:proofErr w:type="spellEnd"/>
+      <w:r>
+        <w:rPr>
+          <w:rFonts w:ascii="Times New Roman" w:hAnsi="Times New Roman" w:cs="Times New Roman"/>
+          <w:sz w:val="24"/>
+          <w:szCs w:val="24"/>
+        </w:rPr>
+        <w:t>.</w:t>
+      </w:r>
+    </w:p>
+    <w:p>
+      <w:pPr>
+        <w:rPr>
+          <w:rFonts w:ascii="Times New Roman" w:hAnsi="Times New Roman" w:cs="Times New Roman"/>
+          <w:sz w:val="24"/>
+          <w:szCs w:val="24"/>
+        </w:rPr>
+      </w:pPr>
+      <w:r>
+        <w:rPr>
+          <w:rFonts w:ascii="Times New Roman" w:hAnsi="Times New Roman" w:cs="Times New Roman"/>
+          <w:sz w:val="24"/>
+          <w:szCs w:val="24"/>
+        </w:rPr>
+        <w:lastRenderedPageBreak/>
+        <w:drawing>
+          <wp:inline distT="0" distB="0" distL="0" distR="0" wp14:anchorId="0A9D2BB7" wp14:editId="0F6FE0F7">
+            <wp:extent cx="5274310" cy="3540760"/>
+            <wp:effectExtent l="0" t="0" r="2540" b="2540"/>
+            <wp:docPr id="1309700359" name="图片 1"/>
+            <wp:cNvGraphicFramePr>
+              <a:graphicFrameLocks xmlns:a="http://schemas.openxmlformats.org/drawingml/2006/main" noChangeAspect="1"/>
+            </wp:cNvGraphicFramePr>
+            <a:graphic xmlns:a="http://schemas.openxmlformats.org/drawingml/2006/main">
+              <a:graphicData uri="http://schemas.openxmlformats.org/drawingml/2006/picture">
+                <pic:pic xmlns:pic="http://schemas.openxmlformats.org/drawingml/2006/picture">
+                  <pic:nvPicPr>
+                    <pic:cNvPr id="1309700359" name=""/>
+                    <pic:cNvPicPr/>
+                  </pic:nvPicPr>
+                  <pic:blipFill>
+                    <a:blip r:embed="rId21"/>
+                    <a:stretch>
+                      <a:fillRect/>
+                    </a:stretch>
+                  </pic:blipFill>
+                  <pic:spPr>
+                    <a:xfrm>
+                      <a:off x="0" y="0"/>
+                      <a:ext cx="5274310" cy="3540760"/>
+                    </a:xfrm>
+                    <a:prstGeom prst="rect">
+                      <a:avLst/>
+                    </a:prstGeom>
+                  </pic:spPr>
+                </pic:pic>
+              </a:graphicData>
+            </a:graphic>
+          </wp:inline>
+        </w:drawing>
+      </w:r>
+    </w:p>
+    <w:p>
+      <w:pPr>
+        <w:pStyle w:val="a9"/>
+        <w:numPr>
+          <w:ilvl w:val="0"/>
+          <w:numId w:val="9"/>
+        </w:numPr>
+        <w:rPr>
+          <w:rFonts w:ascii="Times New Roman" w:hAnsi="Times New Roman" w:cs="Times New Roman"/>
+          <w:sz w:val="24"/>
+          <w:szCs w:val="24"/>
+        </w:rPr>
+      </w:pPr>
+      <w:r>
+        <w:rPr>
+          <w:rFonts w:ascii="Times New Roman" w:hAnsi="Times New Roman" w:cs="Times New Roman"/>
+          <w:sz w:val="24"/>
+          <w:szCs w:val="24"/>
+        </w:rPr>
+        <w:t>The Security page displays the account password status, secondary authentication settings, and configuration of password questions.</w:t>
+      </w:r>
+    </w:p>
+    <w:p>
+      <w:pPr>
+        <w:rPr>
+          <w:rFonts w:ascii="Times New Roman" w:hAnsi="Times New Roman" w:cs="Times New Roman"/>
+          <w:sz w:val="24"/>
+          <w:szCs w:val="24"/>
+        </w:rPr>
+      </w:pPr>
+      <w:r>
+        <w:rPr>
+          <w:rFonts w:ascii="Times New Roman" w:hAnsi="Times New Roman" w:cs="Times New Roman"/>
+          <w:sz w:val="24"/>
+          <w:szCs w:val="24"/>
+        </w:rPr>
+        <w:drawing>
+          <wp:inline distT="0" distB="0" distL="0" distR="0" wp14:anchorId="4AF46F37" wp14:editId="2E104AB0">
+            <wp:extent cx="5274310" cy="3552190"/>
+            <wp:effectExtent l="0" t="0" r="2540" b="0"/>
+            <wp:docPr id="2058422898" name="图片 1"/>
+            <wp:cNvGraphicFramePr>
+              <a:graphicFrameLocks xmlns:a="http://schemas.openxmlformats.org/drawingml/2006/main" noChangeAspect="1"/>
+            </wp:cNvGraphicFramePr>
+            <a:graphic xmlns:a="http://schemas.openxmlformats.org/drawingml/2006/main">
+              <a:graphicData uri="http://schemas.openxmlformats.org/drawingml/2006/picture">
+                <pic:pic xmlns:pic="http://schemas.openxmlformats.org/drawingml/2006/picture">
+                  <pic:nvPicPr>
+                    <pic:cNvPr id="2058422898" name=""/>
+                    <pic:cNvPicPr/>
+                  </pic:nvPicPr>
+                  <pic:blipFill>
+                    <a:blip r:embed="rId22"/>
+                    <a:stretch>
+                      <a:fillRect/>
+                    </a:stretch>
+                  </pic:blipFill>
+                  <pic:spPr>
+                    <a:xfrm>
+                      <a:off x="0" y="0"/>
+                      <a:ext cx="5274310" cy="3552190"/>
+                    </a:xfrm>
+                    <a:prstGeom prst="rect">
+                      <a:avLst/>
+                    </a:prstGeom>
+                  </pic:spPr>
+                </pic:pic>
+              </a:graphicData>
+            </a:graphic>
+          </wp:inline>
+        </w:drawing>
+      </w:r>
+    </w:p>
+    <w:p>
+      <w:pPr>
+        <w:pStyle w:val="71e7dc79-1ff7-45e8-997d-0ebda3762b91"/>
+        <w:rPr>
+          <w:rFonts w:ascii="Times New Roman" w:hAnsi="Times New Roman" w:cs="Times New Roman"/>
+          <w:b w:val="0"/>
+          <w:color w:val="0F4761" w:themeColor="accent1" w:themeShade="BF"/>
+          <w:szCs w:val="28"/>
+        </w:rPr>
+      </w:pPr>
+      <w:r>
+        <w:rPr>
+          <w:rFonts w:ascii="Times New Roman" w:hAnsi="Times New Roman" w:cs="Times New Roman"/>
+          <w:b w:val="0"/>
+          <w:color w:val="0F4761" w:themeColor="accent1" w:themeShade="BF"/>
+          <w:szCs w:val="28"/>
+        </w:rPr>
+        <w:t xml:space="preserve">2.7 </w:t>
+      </w:r>
+      <w:proofErr w:type="spellStart"/>
+      <w:r>
+        <w:rPr>
+          <w:rFonts w:ascii="Times New Roman" w:hAnsi="Times New Roman" w:cs="Times New Roman"/>
+          <w:b w:val="0"/>
+          <w:color w:val="0F4761" w:themeColor="accent1" w:themeShade="BF"/>
+          <w:szCs w:val="28"/>
+        </w:rPr>
+        <w:t>BuckBrain</w:t>
+      </w:r>
+      <w:proofErr w:type="spellEnd"/>
+      <w:r>
+        <w:rPr>
+          <w:rFonts w:ascii="Times New Roman" w:hAnsi="Times New Roman" w:cs="Times New Roman"/>
+          <w:b w:val="0"/>
+          <w:color w:val="0F4761" w:themeColor="accent1" w:themeShade="BF"/>
+          <w:szCs w:val="28"/>
+        </w:rPr>
+        <w:t xml:space="preserve"> AI Assistant</w:t>
+      </w:r>
+    </w:p>
+    <w:p>
+      <w:pPr>
+        <w:pStyle w:val="a9"/>
+        <w:numPr>
+          <w:ilvl w:val="0"/>
+          <w:numId w:val="8"/>
+        </w:numPr>
+        <w:rPr>
+          <w:rFonts w:ascii="Times New Roman" w:hAnsi="Times New Roman" w:cs="Times New Roman"/>
+          <w:sz w:val="24"/>
+          <w:szCs w:val="24"/>
+        </w:rPr>
+      </w:pPr>
+      <w:r>
+        <w:rPr>
+          <w:rFonts w:ascii="Times New Roman" w:hAnsi="Times New Roman" w:cs="Times New Roman"/>
+          <w:sz w:val="24"/>
+          <w:szCs w:val="24"/>
+        </w:rPr>
+        <w:t>In the module, users can type in questions like ‘How can I save money?’ as if they were chatting. and the system generates AI suggestions.</w:t>
+      </w:r>
+    </w:p>
+    <w:p>
+      <w:pPr>
+        <w:rPr>
+          <w:rFonts w:ascii="Times New Roman" w:hAnsi="Times New Roman" w:cs="Times New Roman"/>
+          <w:sz w:val="24"/>
+          <w:szCs w:val="24"/>
+        </w:rPr>
+      </w:pPr>
+      <w:r>
+        <w:rPr>
+          <w:rFonts w:ascii="Times New Roman" w:hAnsi="Times New Roman" w:cs="Times New Roman"/>
+          <w:sz w:val="24"/>
+          <w:szCs w:val="24"/>
+        </w:rPr>
+        <w:lastRenderedPageBreak/>
+        <w:drawing>
+          <wp:inline distT="0" distB="0" distL="0" distR="0" wp14:anchorId="59A2D7FC" wp14:editId="04203360">
+            <wp:extent cx="5274310" cy="3168650"/>
+            <wp:effectExtent l="0" t="0" r="2540" b="0"/>
+            <wp:docPr id="1649555204" name="图片 1"/>
+            <wp:cNvGraphicFramePr>
+              <a:graphicFrameLocks xmlns:a="http://schemas.openxmlformats.org/drawingml/2006/main" noChangeAspect="1"/>
+            </wp:cNvGraphicFramePr>
+            <a:graphic xmlns:a="http://schemas.openxmlformats.org/drawingml/2006/main">
+              <a:graphicData uri="http://schemas.openxmlformats.org/drawingml/2006/picture">
+                <pic:pic xmlns:pic="http://schemas.openxmlformats.org/drawingml/2006/picture">
+                  <pic:nvPicPr>
+                    <pic:cNvPr id="1649555204" name=""/>
+                    <pic:cNvPicPr/>
+                  </pic:nvPicPr>
+                  <pic:blipFill>
+                    <a:blip r:embed="rId23"/>
+                    <a:stretch>
+                      <a:fillRect/>
+                    </a:stretch>
+                  </pic:blipFill>
+                  <pic:spPr>
+                    <a:xfrm>
+                      <a:off x="0" y="0"/>
+                      <a:ext cx="5274310" cy="3168650"/>
+                    </a:xfrm>
+                    <a:prstGeom prst="rect">
+                      <a:avLst/>
+                    </a:prstGeom>
+                  </pic:spPr>
+                </pic:pic>
+              </a:graphicData>
+            </a:graphic>
+          </wp:inline>
+        </w:drawing>
+      </w:r>
+    </w:p>
+    <w:p>
+      <w:pPr>
+        <w:pStyle w:val="71e7dc79-1ff7-45e8-997d-0ebda3762b91"/>
+        <w:rPr>
+          <w:rFonts w:ascii="Times New Roman" w:hAnsi="Times New Roman" w:cs="Times New Roman"/>
+          <w:b w:val="0"/>
+          <w:color w:val="0F4761" w:themeColor="accent1" w:themeShade="BF"/>
+          <w:szCs w:val="28"/>
+        </w:rPr>
+      </w:pPr>
+      <w:r>
+        <w:rPr>
+          <w:rFonts w:ascii="Times New Roman" w:hAnsi="Times New Roman" w:cs="Times New Roman"/>
+          <w:b w:val="0"/>
+          <w:color w:val="0F4761" w:themeColor="accent1" w:themeShade="BF"/>
+          <w:szCs w:val="28"/>
+        </w:rPr>
+        <w:t>2.8</w:t>
+      </w:r>
+      <w:r>
+        <w:rPr>
+          <w:rFonts w:ascii="Times New Roman" w:hAnsi="Times New Roman" w:cs="Times New Roman"/>
+          <w:b w:val="0"/>
+          <w:color w:val="0F4761" w:themeColor="accent1" w:themeShade="BF"/>
+          <w:szCs w:val="28"/>
+        </w:rPr>
+        <w:t xml:space="preserve"> Currency Converter</w:t>
+      </w:r>
+    </w:p>
+    <w:p>
+      <w:pPr>
+        <w:pStyle w:val="acbfdd8b-e11b-4d36-88ff-6049b138f862"/>
+        <w:numPr>
+          <w:ilvl w:val="0"/>
+          <w:numId w:val="8"/>
+        </w:numPr>
+        <w:rPr>
+          <w:rFonts w:ascii="Times New Roman" w:hAnsi="Times New Roman" w:cs="Times New Roman"/>
+          <w:sz w:val="24"/>
+          <w:szCs w:val="24"/>
+        </w:rPr>
+      </w:pPr>
+      <w:r>
+        <w:rPr>
+          <w:rFonts w:ascii="Times New Roman" w:hAnsi="Times New Roman" w:cs="Times New Roman"/>
+          <w:sz w:val="24"/>
+          <w:szCs w:val="24"/>
+        </w:rPr>
+        <w:t>The Currency Converter page supports quick conversion between RMB, USD, EUR and HKD currencies and displays the results.</w:t>
+      </w:r>
+    </w:p>
+    <w:p>
+      <w:pPr>
+        <w:rPr>
+          <w:rFonts w:ascii="Times New Roman" w:hAnsi="Times New Roman" w:cs="Times New Roman"/>
+          <w:sz w:val="24"/>
+          <w:szCs w:val="24"/>
+        </w:rPr>
+      </w:pPr>
+      <w:r>
+        <w:rPr>
+          <w:rFonts w:ascii="Times New Roman" w:hAnsi="Times New Roman" w:cs="Times New Roman"/>
+          <w:noProof/>
+          <w:sz w:val="24"/>
+          <w:szCs w:val="24"/>
+        </w:rPr>
+        <w:drawing>
+          <wp:inline distT="0" distB="0" distL="0" distR="0" wp14:anchorId="3E81804B" wp14:editId="7641BA1C">
+            <wp:extent cx="5274310" cy="3541395"/>
+            <wp:effectExtent l="0" t="0" r="2540" b="1905"/>
+            <wp:docPr id="1923309644" name="图片 3"/>
+            <wp:cNvGraphicFramePr>
+              <a:graphicFrameLocks xmlns:a="http://schemas.openxmlformats.org/drawingml/2006/main" noChangeAspect="1"/>
+            </wp:cNvGraphicFramePr>
+            <a:graphic xmlns:a="http://schemas.openxmlformats.org/drawingml/2006/main">
+              <a:graphicData uri="http://schemas.openxmlformats.org/drawingml/2006/picture">
+                <pic:pic xmlns:pic="http://schemas.openxmlformats.org/drawingml/2006/picture">
+                  <pic:nvPicPr>
+                    <pic:cNvPr id="0" name="Picture 3"/>
                     <pic:cNvPicPr>
                       <a:picLocks noChangeAspect="1" noChangeArrowheads="1"/>
                     </pic:cNvPicPr>
                   </pic:nvPicPr>
                   <pic:blipFill>
-                    <a:blip r:embed="rId14" cstate="print">
+                    <a:blip r:embed="rId24" cstate="print">
                       <a:extLst>
                         <a:ext uri="{28A0092B-C50C-407E-A947-70E740481C1C}">
                           <a14:useLocalDpi xmlns:a14="http://schemas.microsoft.com/office/drawing/2010/main" val="0"/>
@@ -875,7 +1857,7 @@
                   <pic:spPr bwMode="auto">
                     <a:xfrm>
                       <a:off x="0" y="0"/>
-                      <a:ext cx="5274310" cy="3529965"/>
+                      <a:ext cx="5274310" cy="3541395"/>
                     </a:xfrm>
                     <a:prstGeom prst="rect">
                       <a:avLst/>
@@ -892,853 +1874,9 @@
         </w:drawing>
       </w:r>
     </w:p>
-    <w:p>
-      <w:pPr>
-        <w:pStyle w:val="71e7dc79-1ff7-45e8-997d-0ebda3762b91"/>
-        <w:rPr>
-          <w:rFonts w:ascii="Segoe Fluent Icons" w:hAnsi="Segoe Fluent Icons"/>
-          <w:sz w:val="24"/>
-          <w:szCs w:val="24"/>
-        </w:rPr>
-      </w:pPr>
-      <w:r>
-        <w:rPr>
-          <w:rFonts w:ascii="Segoe Fluent Icons" w:hAnsi="Segoe Fluent Icons"/>
-          <w:sz w:val="24"/>
-          <w:szCs w:val="24"/>
-        </w:rPr>
-        <w:lastRenderedPageBreak/>
-        <w:t>2.4 Analysis of consumption trend</w:t>
-      </w:r>
-    </w:p>
-    <w:p>
-      <w:pPr>
-        <w:pStyle w:val="acbfdd8b-e11b-4d36-88ff-6049b138f862"/>
-        <w:numPr>
-          <w:ilvl w:val="0"/>
-          <w:numId w:val="6"/>
-        </w:numPr>
-        <w:rPr>
-          <w:rFonts w:ascii="Segoe Fluent Icons" w:hAnsi="Segoe Fluent Icons"/>
-          <w:sz w:val="24"/>
-          <w:szCs w:val="24"/>
-        </w:rPr>
-      </w:pPr>
-      <w:r>
-        <w:rPr>
-          <w:rFonts w:ascii="Segoe Fluent Icons" w:hAnsi="Segoe Fluent Icons"/>
-          <w:sz w:val="24"/>
-          <w:szCs w:val="24"/>
-        </w:rPr>
-        <w:t>Display annual income and expenditure trends and monthly income and expenditure trends.</w:t>
-      </w:r>
-    </w:p>
-    <w:p>
-      <w:pPr>
-        <w:pStyle w:val="acbfdd8b-e11b-4d36-88ff-6049b138f862"/>
-        <w:numPr>
-          <w:ilvl w:val="0"/>
-          <w:numId w:val="6"/>
-        </w:numPr>
-        <w:rPr>
-          <w:rFonts w:ascii="Segoe Fluent Icons" w:hAnsi="Segoe Fluent Icons"/>
-          <w:sz w:val="24"/>
-          <w:szCs w:val="24"/>
-        </w:rPr>
-      </w:pPr>
-      <w:r>
-        <w:rPr>
-          <w:rFonts w:ascii="Segoe Fluent Icons" w:hAnsi="Segoe Fluent Icons"/>
-          <w:sz w:val="24"/>
-          <w:szCs w:val="24"/>
-        </w:rPr>
-        <w:t>Textual summary of AI analysis results</w:t>
-      </w:r>
-    </w:p>
-    <w:p>
-      <w:pPr>
-        <w:pStyle w:val="acbfdd8b-e11b-4d36-88ff-6049b138f862"/>
-        <w:numPr>
-          <w:ilvl w:val="0"/>
-          <w:numId w:val="6"/>
-        </w:numPr>
-        <w:rPr>
-          <w:rFonts w:ascii="Segoe Fluent Icons" w:hAnsi="Segoe Fluent Icons"/>
-          <w:sz w:val="24"/>
-          <w:szCs w:val="24"/>
-        </w:rPr>
-      </w:pPr>
-      <w:r>
-        <w:rPr>
-          <w:rFonts w:ascii="Segoe Fluent Icons" w:hAnsi="Segoe Fluent Icons"/>
-          <w:sz w:val="24"/>
-          <w:szCs w:val="24"/>
-        </w:rPr>
-        <w:t>Provide Generate Report button to generate report</w:t>
-      </w:r>
-    </w:p>
-    <w:p>
-      <w:pPr>
-        <w:rPr>
-          <w:rFonts w:ascii="Segoe Fluent Icons" w:hAnsi="Segoe Fluent Icons"/>
-          <w:sz w:val="24"/>
-          <w:szCs w:val="24"/>
-        </w:rPr>
-      </w:pPr>
-      <w:r>
-        <w:rPr>
-          <w:rFonts w:ascii="Segoe Fluent Icons" w:hAnsi="Segoe Fluent Icons"/>
-          <w:noProof/>
-          <w:sz w:val="24"/>
-          <w:szCs w:val="24"/>
-        </w:rPr>
-        <w:drawing>
-          <wp:inline distT="0" distB="0" distL="0" distR="0" wp14:anchorId="32406A76" wp14:editId="34D196A2">
-            <wp:extent cx="5274310" cy="3498215"/>
-            <wp:effectExtent l="0" t="0" r="2540" b="6985"/>
-            <wp:docPr id="1008384809" name="图片 1"/>
-            <wp:cNvGraphicFramePr>
-              <a:graphicFrameLocks xmlns:a="http://schemas.openxmlformats.org/drawingml/2006/main" noChangeAspect="1"/>
-            </wp:cNvGraphicFramePr>
-            <a:graphic xmlns:a="http://schemas.openxmlformats.org/drawingml/2006/main">
-              <a:graphicData uri="http://schemas.openxmlformats.org/drawingml/2006/picture">
-                <pic:pic xmlns:pic="http://schemas.openxmlformats.org/drawingml/2006/picture">
-                  <pic:nvPicPr>
-                    <pic:cNvPr id="1008384809" name=""/>
-                    <pic:cNvPicPr/>
-                  </pic:nvPicPr>
-                  <pic:blipFill>
-                    <a:blip r:embed="rId15"/>
-                    <a:stretch>
-                      <a:fillRect/>
-                    </a:stretch>
-                  </pic:blipFill>
-                  <pic:spPr>
-                    <a:xfrm>
-                      <a:off x="0" y="0"/>
-                      <a:ext cx="5274310" cy="3498215"/>
-                    </a:xfrm>
-                    <a:prstGeom prst="rect">
-                      <a:avLst/>
-                    </a:prstGeom>
-                  </pic:spPr>
-                </pic:pic>
-              </a:graphicData>
-            </a:graphic>
-          </wp:inline>
-        </w:drawing>
-      </w:r>
-    </w:p>
-    <w:p>
-      <w:pPr>
-        <w:pStyle w:val="71e7dc79-1ff7-45e8-997d-0ebda3762b91"/>
-        <w:spacing w:line="240" w:lineRule="auto"/>
-        <w:rPr>
-          <w:rFonts w:ascii="Segoe Fluent Icons" w:hAnsi="Segoe Fluent Icons"/>
-          <w:sz w:val="24"/>
-          <w:szCs w:val="24"/>
-        </w:rPr>
-      </w:pPr>
-      <w:r>
-        <w:rPr>
-          <w:rFonts w:ascii="Segoe Fluent Icons" w:hAnsi="Segoe Fluent Icons"/>
-          <w:sz w:val="24"/>
-          <w:szCs w:val="24"/>
-        </w:rPr>
-        <w:t>2.5 Credit Card Management</w:t>
-      </w:r>
-    </w:p>
-    <w:p>
-      <w:pPr>
-        <w:pStyle w:val="a9"/>
-        <w:numPr>
-          <w:ilvl w:val="0"/>
-          <w:numId w:val="7"/>
-        </w:numPr>
-        <w:rPr>
-          <w:rFonts w:ascii="Segoe Fluent Icons" w:hAnsi="Segoe Fluent Icons"/>
-          <w:sz w:val="24"/>
-          <w:szCs w:val="24"/>
-        </w:rPr>
-      </w:pPr>
-      <w:r>
-        <w:rPr>
-          <w:rFonts w:ascii="Segoe Fluent Icons" w:hAnsi="Segoe Fluent Icons"/>
-          <w:sz w:val="24"/>
-          <w:szCs w:val="24"/>
-        </w:rPr>
-        <w:t>On the left side is a list of card information (type, bank, card number, cardholder) and on the right side is a pie chart of card account statistics.</w:t>
-      </w:r>
-    </w:p>
-    <w:p>
-      <w:pPr>
-        <w:pStyle w:val="a9"/>
-        <w:numPr>
-          <w:ilvl w:val="0"/>
-          <w:numId w:val="7"/>
-        </w:numPr>
-        <w:rPr>
-          <w:rFonts w:ascii="Segoe Fluent Icons" w:hAnsi="Segoe Fluent Icons"/>
-          <w:sz w:val="24"/>
-          <w:szCs w:val="24"/>
-        </w:rPr>
-      </w:pPr>
-      <w:r>
-        <w:rPr>
-          <w:rFonts w:ascii="Segoe Fluent Icons" w:hAnsi="Segoe Fluent Icons"/>
-          <w:sz w:val="24"/>
-          <w:szCs w:val="24"/>
-        </w:rPr>
-        <w:t>The lower form supports adding new cards, which requires filling in the card type, card number, cardholder name, and expiration time.</w:t>
-      </w:r>
-    </w:p>
-    <w:p>
-      <w:pPr>
-        <w:rPr>
-          <w:rFonts w:ascii="Segoe Fluent Icons" w:hAnsi="Segoe Fluent Icons"/>
-          <w:sz w:val="24"/>
-          <w:szCs w:val="24"/>
-        </w:rPr>
-      </w:pPr>
-    </w:p>
-    <w:p>
-      <w:pPr>
-        <w:rPr>
-          <w:rFonts w:ascii="Segoe Fluent Icons" w:hAnsi="Segoe Fluent Icons"/>
-          <w:sz w:val="24"/>
-          <w:szCs w:val="24"/>
-        </w:rPr>
-      </w:pPr>
-    </w:p>
-    <w:p>
-      <w:pPr>
-        <w:rPr>
-          <w:rFonts w:ascii="Segoe Fluent Icons" w:hAnsi="Segoe Fluent Icons"/>
-          <w:sz w:val="24"/>
-          <w:szCs w:val="24"/>
-        </w:rPr>
-      </w:pPr>
-      <w:r>
-        <w:rPr>
-          <w:rFonts w:ascii="Segoe Fluent Icons" w:hAnsi="Segoe Fluent Icons"/>
-          <w:noProof/>
-          <w:sz w:val="24"/>
-          <w:szCs w:val="24"/>
-        </w:rPr>
-        <w:lastRenderedPageBreak/>
-        <w:drawing>
-          <wp:inline distT="0" distB="0" distL="0" distR="0" wp14:anchorId="4D113709" wp14:editId="4B64C047">
-            <wp:extent cx="5274310" cy="3505200"/>
-            <wp:effectExtent l="0" t="0" r="2540" b="0"/>
-            <wp:docPr id="204850912" name="图片 1"/>
-            <wp:cNvGraphicFramePr>
-              <a:graphicFrameLocks xmlns:a="http://schemas.openxmlformats.org/drawingml/2006/main" noChangeAspect="1"/>
-            </wp:cNvGraphicFramePr>
-            <a:graphic xmlns:a="http://schemas.openxmlformats.org/drawingml/2006/main">
-              <a:graphicData uri="http://schemas.openxmlformats.org/drawingml/2006/picture">
-                <pic:pic xmlns:pic="http://schemas.openxmlformats.org/drawingml/2006/picture">
-                  <pic:nvPicPr>
-                    <pic:cNvPr id="204850912" name=""/>
-                    <pic:cNvPicPr/>
-                  </pic:nvPicPr>
-                  <pic:blipFill>
-                    <a:blip r:embed="rId16"/>
-                    <a:stretch>
-                      <a:fillRect/>
-                    </a:stretch>
-                  </pic:blipFill>
-                  <pic:spPr>
-                    <a:xfrm>
-                      <a:off x="0" y="0"/>
-                      <a:ext cx="5274310" cy="3505200"/>
-                    </a:xfrm>
-                    <a:prstGeom prst="rect">
-                      <a:avLst/>
-                    </a:prstGeom>
-                  </pic:spPr>
-                </pic:pic>
-              </a:graphicData>
-            </a:graphic>
-          </wp:inline>
-        </w:drawing>
-      </w:r>
-    </w:p>
-    <w:p>
-      <w:pPr>
-        <w:pStyle w:val="71e7dc79-1ff7-45e8-997d-0ebda3762b91"/>
-        <w:rPr>
-          <w:rFonts w:ascii="Segoe Fluent Icons" w:hAnsi="Segoe Fluent Icons"/>
-          <w:sz w:val="24"/>
-          <w:szCs w:val="24"/>
-        </w:rPr>
-      </w:pPr>
-      <w:r>
-        <w:rPr>
-          <w:rFonts w:ascii="Segoe Fluent Icons" w:hAnsi="Segoe Fluent Icons"/>
-          <w:sz w:val="24"/>
-          <w:szCs w:val="24"/>
-        </w:rPr>
-        <w:t>2.6 Setup Page</w:t>
-      </w:r>
-    </w:p>
-    <w:p>
-      <w:pPr>
-        <w:pStyle w:val="acbfdd8b-e11b-4d36-88ff-6049b138f862"/>
-        <w:numPr>
-          <w:ilvl w:val="0"/>
-          <w:numId w:val="9"/>
-        </w:numPr>
-        <w:rPr>
-          <w:rFonts w:ascii="Segoe Fluent Icons" w:hAnsi="Segoe Fluent Icons"/>
-          <w:sz w:val="24"/>
-          <w:szCs w:val="24"/>
-        </w:rPr>
-      </w:pPr>
-      <w:r>
-        <w:rPr>
-          <w:rFonts w:ascii="Segoe Fluent Icons" w:hAnsi="Segoe Fluent Icons"/>
-          <w:sz w:val="24"/>
-          <w:szCs w:val="24"/>
-        </w:rPr>
-        <w:t>The Profile page allows users to view and modify personal information such as name, email and date of birth.</w:t>
-      </w:r>
-    </w:p>
-    <w:p>
-      <w:pPr>
-        <w:rPr>
-          <w:rFonts w:ascii="Segoe Fluent Icons" w:hAnsi="Segoe Fluent Icons"/>
-          <w:sz w:val="24"/>
-          <w:szCs w:val="24"/>
-        </w:rPr>
-      </w:pPr>
-      <w:r>
-        <w:rPr>
-          <w:rFonts w:ascii="Segoe Fluent Icons" w:hAnsi="Segoe Fluent Icons"/>
-          <w:noProof/>
-          <w:sz w:val="24"/>
-          <w:szCs w:val="24"/>
-        </w:rPr>
-        <w:drawing>
-          <wp:inline distT="0" distB="0" distL="0" distR="0" wp14:anchorId="20706398" wp14:editId="13C5376E">
-            <wp:extent cx="5274310" cy="3540125"/>
-            <wp:effectExtent l="0" t="0" r="2540" b="3175"/>
-            <wp:docPr id="488869266" name="图片 3" descr="用户上传的图片"/>
-            <wp:cNvGraphicFramePr>
-              <a:graphicFrameLocks xmlns:a="http://schemas.openxmlformats.org/drawingml/2006/main" noChangeAspect="1"/>
-            </wp:cNvGraphicFramePr>
-            <a:graphic xmlns:a="http://schemas.openxmlformats.org/drawingml/2006/main">
-              <a:graphicData uri="http://schemas.openxmlformats.org/drawingml/2006/picture">
-                <pic:pic xmlns:pic="http://schemas.openxmlformats.org/drawingml/2006/picture">
-                  <pic:nvPicPr>
-                    <pic:cNvPr id="0" name="Picture 5" descr="用户上传的图片"/>
-                    <pic:cNvPicPr>
-                      <a:picLocks noChangeAspect="1" noChangeArrowheads="1"/>
-                    </pic:cNvPicPr>
-                  </pic:nvPicPr>
-                  <pic:blipFill>
-                    <a:blip r:embed="rId17" cstate="print">
-                      <a:extLst>
-                        <a:ext uri="{28A0092B-C50C-407E-A947-70E740481C1C}">
-                          <a14:useLocalDpi xmlns:a14="http://schemas.microsoft.com/office/drawing/2010/main" val="0"/>
-                        </a:ext>
-                      </a:extLst>
-                    </a:blip>
-                    <a:srcRect/>
-                    <a:stretch>
-                      <a:fillRect/>
-                    </a:stretch>
-                  </pic:blipFill>
-                  <pic:spPr bwMode="auto">
-                    <a:xfrm>
-                      <a:off x="0" y="0"/>
-                      <a:ext cx="5274310" cy="3540125"/>
-                    </a:xfrm>
-                    <a:prstGeom prst="rect">
-                      <a:avLst/>
-                    </a:prstGeom>
-                    <a:noFill/>
-                    <a:ln>
-                      <a:noFill/>
-                    </a:ln>
-                  </pic:spPr>
-                </pic:pic>
-              </a:graphicData>
-            </a:graphic>
-          </wp:inline>
-        </w:drawing>
-      </w:r>
-    </w:p>
-    <w:p>
-      <w:pPr>
-        <w:pStyle w:val="a9"/>
-        <w:numPr>
-          <w:ilvl w:val="0"/>
-          <w:numId w:val="9"/>
-        </w:numPr>
-        <w:ind w:left="442" w:hanging="442"/>
-        <w:rPr>
-          <w:rFonts w:ascii="Segoe Fluent Icons" w:hAnsi="Segoe Fluent Icons"/>
-          <w:sz w:val="24"/>
-          <w:szCs w:val="24"/>
-        </w:rPr>
-      </w:pPr>
-      <w:r>
-        <w:rPr>
-          <w:rFonts w:ascii="Segoe Fluent Icons" w:hAnsi="Segoe Fluent Icons"/>
-          <w:sz w:val="24"/>
-          <w:szCs w:val="24"/>
-        </w:rPr>
-        <w:t xml:space="preserve">The Preferences page provides options for preferences such as currency, time zone, notifications, and budget </w:t>
-      </w:r>
-      <w:proofErr w:type="spellStart"/>
-      <w:r>
-        <w:rPr>
-          <w:rFonts w:ascii="Segoe Fluent Icons" w:hAnsi="Segoe Fluent Icons"/>
-          <w:sz w:val="24"/>
-          <w:szCs w:val="24"/>
-        </w:rPr>
-        <w:t>limitis</w:t>
-      </w:r>
-      <w:proofErr w:type="spellEnd"/>
-      <w:r>
-        <w:rPr>
-          <w:rFonts w:ascii="Segoe Fluent Icons" w:hAnsi="Segoe Fluent Icons"/>
-          <w:sz w:val="24"/>
-          <w:szCs w:val="24"/>
-        </w:rPr>
-        <w:t>.</w:t>
-      </w:r>
-    </w:p>
-    <w:p>
-      <w:pPr>
-        <w:rPr>
-          <w:rFonts w:ascii="Segoe Fluent Icons" w:hAnsi="Segoe Fluent Icons"/>
-          <w:sz w:val="24"/>
-          <w:szCs w:val="24"/>
-        </w:rPr>
-      </w:pPr>
-      <w:r>
-        <w:rPr>
-          <w:rFonts w:ascii="Segoe Fluent Icons" w:hAnsi="Segoe Fluent Icons"/>
-          <w:noProof/>
-          <w:sz w:val="24"/>
-          <w:szCs w:val="24"/>
-        </w:rPr>
-        <w:lastRenderedPageBreak/>
-        <w:drawing>
-          <wp:inline distT="0" distB="0" distL="0" distR="0" wp14:anchorId="1D612B6A" wp14:editId="263D2BC7">
-            <wp:extent cx="5274310" cy="3529330"/>
-            <wp:effectExtent l="0" t="0" r="2540" b="0"/>
-            <wp:docPr id="354963679" name="图片 4" descr="用户上传的图片"/>
-            <wp:cNvGraphicFramePr>
-              <a:graphicFrameLocks xmlns:a="http://schemas.openxmlformats.org/drawingml/2006/main" noChangeAspect="1"/>
-            </wp:cNvGraphicFramePr>
-            <a:graphic xmlns:a="http://schemas.openxmlformats.org/drawingml/2006/main">
-              <a:graphicData uri="http://schemas.openxmlformats.org/drawingml/2006/picture">
-                <pic:pic xmlns:pic="http://schemas.openxmlformats.org/drawingml/2006/picture">
-                  <pic:nvPicPr>
-                    <pic:cNvPr id="0" name="Picture 7" descr="用户上传的图片"/>
-                    <pic:cNvPicPr>
-                      <a:picLocks noChangeAspect="1" noChangeArrowheads="1"/>
-                    </pic:cNvPicPr>
-                  </pic:nvPicPr>
-                  <pic:blipFill>
-                    <a:blip r:embed="rId18" cstate="print">
-                      <a:extLst>
-                        <a:ext uri="{28A0092B-C50C-407E-A947-70E740481C1C}">
-                          <a14:useLocalDpi xmlns:a14="http://schemas.microsoft.com/office/drawing/2010/main" val="0"/>
-                        </a:ext>
-                      </a:extLst>
-                    </a:blip>
-                    <a:srcRect/>
-                    <a:stretch>
-                      <a:fillRect/>
-                    </a:stretch>
-                  </pic:blipFill>
-                  <pic:spPr bwMode="auto">
-                    <a:xfrm>
-                      <a:off x="0" y="0"/>
-                      <a:ext cx="5274310" cy="3529330"/>
-                    </a:xfrm>
-                    <a:prstGeom prst="rect">
-                      <a:avLst/>
-                    </a:prstGeom>
-                    <a:noFill/>
-                    <a:ln>
-                      <a:noFill/>
-                    </a:ln>
-                  </pic:spPr>
-                </pic:pic>
-              </a:graphicData>
-            </a:graphic>
-          </wp:inline>
-        </w:drawing>
-      </w:r>
-    </w:p>
-    <w:p>
-      <w:pPr>
-        <w:pStyle w:val="a9"/>
-        <w:numPr>
-          <w:ilvl w:val="0"/>
-          <w:numId w:val="9"/>
-        </w:numPr>
-        <w:rPr>
-          <w:rFonts w:ascii="Segoe Fluent Icons" w:hAnsi="Segoe Fluent Icons"/>
-          <w:sz w:val="24"/>
-          <w:szCs w:val="24"/>
-        </w:rPr>
-      </w:pPr>
-      <w:r>
-        <w:rPr>
-          <w:rFonts w:ascii="Segoe Fluent Icons" w:hAnsi="Segoe Fluent Icons"/>
-          <w:sz w:val="24"/>
-          <w:szCs w:val="24"/>
-        </w:rPr>
-        <w:t>The Security page displays the account password status, secondary authentication settings, and configuration of password questions.</w:t>
-      </w:r>
-    </w:p>
-    <w:p>
-      <w:pPr>
-        <w:rPr>
-          <w:rFonts w:ascii="Segoe Fluent Icons" w:hAnsi="Segoe Fluent Icons"/>
-          <w:sz w:val="24"/>
-          <w:szCs w:val="24"/>
-        </w:rPr>
-      </w:pPr>
-      <w:r>
-        <w:rPr>
-          <w:rFonts w:ascii="Segoe Fluent Icons" w:hAnsi="Segoe Fluent Icons"/>
-          <w:noProof/>
-          <w:sz w:val="24"/>
-          <w:szCs w:val="24"/>
-        </w:rPr>
-        <w:drawing>
-          <wp:inline distT="0" distB="0" distL="0" distR="0" wp14:anchorId="2D6F221F" wp14:editId="18AFAAEE">
-            <wp:extent cx="5274310" cy="3507105"/>
-            <wp:effectExtent l="0" t="0" r="2540" b="0"/>
-            <wp:docPr id="395658888" name="图片 5" descr="用户上传的图片"/>
-            <wp:cNvGraphicFramePr>
-              <a:graphicFrameLocks xmlns:a="http://schemas.openxmlformats.org/drawingml/2006/main" noChangeAspect="1"/>
-            </wp:cNvGraphicFramePr>
-            <a:graphic xmlns:a="http://schemas.openxmlformats.org/drawingml/2006/main">
-              <a:graphicData uri="http://schemas.openxmlformats.org/drawingml/2006/picture">
-                <pic:pic xmlns:pic="http://schemas.openxmlformats.org/drawingml/2006/picture">
-                  <pic:nvPicPr>
-                    <pic:cNvPr id="0" name="Picture 9" descr="用户上传的图片"/>
-                    <pic:cNvPicPr>
-                      <a:picLocks noChangeAspect="1" noChangeArrowheads="1"/>
-                    </pic:cNvPicPr>
-                  </pic:nvPicPr>
-                  <pic:blipFill>
-                    <a:blip r:embed="rId19" cstate="print">
-                      <a:extLst>
-                        <a:ext uri="{28A0092B-C50C-407E-A947-70E740481C1C}">
-                          <a14:useLocalDpi xmlns:a14="http://schemas.microsoft.com/office/drawing/2010/main" val="0"/>
-                        </a:ext>
-                      </a:extLst>
-                    </a:blip>
-                    <a:srcRect/>
-                    <a:stretch>
-                      <a:fillRect/>
-                    </a:stretch>
-                  </pic:blipFill>
-                  <pic:spPr bwMode="auto">
-                    <a:xfrm>
-                      <a:off x="0" y="0"/>
-                      <a:ext cx="5274310" cy="3507105"/>
-                    </a:xfrm>
-                    <a:prstGeom prst="rect">
-                      <a:avLst/>
-                    </a:prstGeom>
-                    <a:noFill/>
-                    <a:ln>
-                      <a:noFill/>
-                    </a:ln>
-                  </pic:spPr>
-                </pic:pic>
-              </a:graphicData>
-            </a:graphic>
-          </wp:inline>
-        </w:drawing>
-      </w:r>
-    </w:p>
-    <w:p>
-      <w:pPr>
-        <w:pStyle w:val="71e7dc79-1ff7-45e8-997d-0ebda3762b91"/>
-        <w:rPr>
-          <w:rFonts w:ascii="Segoe Fluent Icons" w:hAnsi="Segoe Fluent Icons"/>
-          <w:sz w:val="24"/>
-          <w:szCs w:val="24"/>
-        </w:rPr>
-      </w:pPr>
-      <w:r>
-        <w:rPr>
-          <w:rFonts w:ascii="Segoe Fluent Icons" w:hAnsi="Segoe Fluent Icons"/>
-          <w:sz w:val="24"/>
-          <w:szCs w:val="24"/>
-        </w:rPr>
-        <w:t xml:space="preserve">2.7 </w:t>
-      </w:r>
-      <w:proofErr w:type="spellStart"/>
-      <w:r>
-        <w:rPr>
-          <w:rFonts w:ascii="Segoe Fluent Icons" w:hAnsi="Segoe Fluent Icons"/>
-          <w:sz w:val="24"/>
-          <w:szCs w:val="24"/>
-        </w:rPr>
-        <w:t>BuckBrain</w:t>
-      </w:r>
-      <w:proofErr w:type="spellEnd"/>
-      <w:r>
-        <w:rPr>
-          <w:rFonts w:ascii="Segoe Fluent Icons" w:hAnsi="Segoe Fluent Icons"/>
-          <w:sz w:val="24"/>
-          <w:szCs w:val="24"/>
-        </w:rPr>
-        <w:t xml:space="preserve"> AI Assistant</w:t>
-      </w:r>
-    </w:p>
-    <w:p>
-      <w:pPr>
-        <w:pStyle w:val="a9"/>
-        <w:numPr>
-          <w:ilvl w:val="0"/>
-          <w:numId w:val="8"/>
-        </w:numPr>
-        <w:rPr>
-          <w:rFonts w:ascii="Segoe Fluent Icons" w:hAnsi="Segoe Fluent Icons"/>
-          <w:sz w:val="24"/>
-          <w:szCs w:val="24"/>
-        </w:rPr>
-      </w:pPr>
-      <w:r>
-        <w:rPr>
-          <w:rFonts w:ascii="Segoe Fluent Icons" w:hAnsi="Segoe Fluent Icons"/>
-          <w:sz w:val="24"/>
-          <w:szCs w:val="24"/>
-        </w:rPr>
-        <w:t xml:space="preserve">In the module, users can type in questions like </w:t>
-      </w:r>
-      <w:r>
-        <w:rPr>
-          <w:rFonts w:ascii="Times New Roman" w:hAnsi="Times New Roman" w:cs="Times New Roman"/>
-          <w:sz w:val="24"/>
-          <w:szCs w:val="24"/>
-        </w:rPr>
-        <w:t>‘</w:t>
-      </w:r>
-      <w:r>
-        <w:rPr>
-          <w:rFonts w:ascii="Segoe Fluent Icons" w:hAnsi="Segoe Fluent Icons"/>
-          <w:sz w:val="24"/>
-          <w:szCs w:val="24"/>
-        </w:rPr>
-        <w:t>How can I save money?</w:t>
-      </w:r>
-      <w:r>
-        <w:rPr>
-          <w:rFonts w:ascii="Cambria" w:hAnsi="Cambria" w:cs="Cambria"/>
-          <w:sz w:val="24"/>
-          <w:szCs w:val="24"/>
-        </w:rPr>
-        <w:t>’</w:t>
-      </w:r>
-      <w:r>
-        <w:rPr>
-          <w:rFonts w:ascii="Segoe Fluent Icons" w:hAnsi="Segoe Fluent Icons"/>
-          <w:sz w:val="24"/>
-          <w:szCs w:val="24"/>
-        </w:rPr>
-        <w:t xml:space="preserve"> as if they were chatting. and the system generates AI suggestions.</w:t>
-      </w:r>
-    </w:p>
-    <w:p>
-      <w:pPr>
-        <w:rPr>
-          <w:rFonts w:ascii="Segoe Fluent Icons" w:hAnsi="Segoe Fluent Icons"/>
-          <w:sz w:val="24"/>
-          <w:szCs w:val="24"/>
-        </w:rPr>
-      </w:pPr>
-      <w:r>
-        <w:rPr>
-          <w:rFonts w:ascii="Segoe Fluent Icons" w:hAnsi="Segoe Fluent Icons"/>
-          <w:noProof/>
-          <w:sz w:val="24"/>
-          <w:szCs w:val="24"/>
-        </w:rPr>
-        <w:lastRenderedPageBreak/>
-        <w:drawing>
-          <wp:inline distT="0" distB="0" distL="0" distR="0" wp14:anchorId="6E97DAEE" wp14:editId="41BA5CDD">
-            <wp:extent cx="5274310" cy="3494405"/>
-            <wp:effectExtent l="0" t="0" r="2540" b="0"/>
-            <wp:docPr id="216216291" name="图片 1"/>
-            <wp:cNvGraphicFramePr>
-              <a:graphicFrameLocks xmlns:a="http://schemas.openxmlformats.org/drawingml/2006/main" noChangeAspect="1"/>
-            </wp:cNvGraphicFramePr>
-            <a:graphic xmlns:a="http://schemas.openxmlformats.org/drawingml/2006/main">
-              <a:graphicData uri="http://schemas.openxmlformats.org/drawingml/2006/picture">
-                <pic:pic xmlns:pic="http://schemas.openxmlformats.org/drawingml/2006/picture">
-                  <pic:nvPicPr>
-                    <pic:cNvPr id="216216291" name=""/>
-                    <pic:cNvPicPr/>
-                  </pic:nvPicPr>
-                  <pic:blipFill>
-                    <a:blip r:embed="rId20"/>
-                    <a:stretch>
-                      <a:fillRect/>
-                    </a:stretch>
-                  </pic:blipFill>
-                  <pic:spPr>
-                    <a:xfrm>
-                      <a:off x="0" y="0"/>
-                      <a:ext cx="5274310" cy="3494405"/>
-                    </a:xfrm>
-                    <a:prstGeom prst="rect">
-                      <a:avLst/>
-                    </a:prstGeom>
-                  </pic:spPr>
-                </pic:pic>
-              </a:graphicData>
-            </a:graphic>
-          </wp:inline>
-        </w:drawing>
-      </w:r>
-    </w:p>
-    <w:p>
-      <w:pPr>
-        <w:pStyle w:val="71e7dc79-1ff7-45e8-997d-0ebda3762b91"/>
-        <w:rPr>
-          <w:rFonts w:ascii="Segoe Fluent Icons" w:hAnsi="Segoe Fluent Icons"/>
-          <w:sz w:val="24"/>
-          <w:szCs w:val="24"/>
-        </w:rPr>
-      </w:pPr>
-      <w:r>
-        <w:rPr>
-          <w:rFonts w:ascii="Segoe Fluent Icons" w:hAnsi="Segoe Fluent Icons"/>
-          <w:sz w:val="24"/>
-          <w:szCs w:val="24"/>
-        </w:rPr>
-        <w:t>2.8</w:t>
-      </w:r>
-      <w:r>
-        <w:rPr>
-          <w:rFonts w:ascii="Segoe Fluent Icons" w:hAnsi="Segoe Fluent Icons"/>
-          <w:sz w:val="24"/>
-          <w:szCs w:val="24"/>
-        </w:rPr>
-        <w:t xml:space="preserve"> Currency Converter</w:t>
-      </w:r>
-    </w:p>
-    <w:p>
-      <w:pPr>
-        <w:pStyle w:val="acbfdd8b-e11b-4d36-88ff-6049b138f862"/>
-        <w:numPr>
-          <w:ilvl w:val="0"/>
-          <w:numId w:val="8"/>
-        </w:numPr>
-        <w:rPr>
-          <w:rFonts w:ascii="Segoe Fluent Icons" w:hAnsi="Segoe Fluent Icons"/>
-          <w:sz w:val="24"/>
-          <w:szCs w:val="24"/>
-        </w:rPr>
-      </w:pPr>
-      <w:r>
-        <w:rPr>
-          <w:rFonts w:ascii="Segoe Fluent Icons" w:hAnsi="Segoe Fluent Icons"/>
-          <w:sz w:val="24"/>
-          <w:szCs w:val="24"/>
-        </w:rPr>
-        <w:t>The Currency Converter page supports quick conversion between RMB, USD, EUR and HKD currencies and displays the results.</w:t>
-      </w:r>
-    </w:p>
-    <w:p>
-      <w:pPr>
-        <w:pStyle w:val="acbfdd8b-e11b-4d36-88ff-6049b138f862"/>
-        <w:numPr>
-          <w:ilvl w:val="0"/>
-          <w:numId w:val="0"/>
-        </w:numPr>
-        <w:rPr>
-          <w:rFonts w:ascii="Segoe Fluent Icons" w:hAnsi="Segoe Fluent Icons"/>
-          <w:sz w:val="24"/>
-          <w:szCs w:val="24"/>
-        </w:rPr>
-      </w:pPr>
-    </w:p>
-    <w:p>
-      <w:pPr>
-        <w:rPr>
-          <w:rFonts w:ascii="Segoe Fluent Icons" w:hAnsi="Segoe Fluent Icons"/>
-          <w:sz w:val="24"/>
-          <w:szCs w:val="24"/>
-        </w:rPr>
-      </w:pPr>
-      <w:r>
-        <w:rPr>
-          <w:rFonts w:ascii="Segoe Fluent Icons" w:hAnsi="Segoe Fluent Icons"/>
-          <w:noProof/>
-          <w:sz w:val="24"/>
-          <w:szCs w:val="24"/>
-        </w:rPr>
-        <w:drawing>
-          <wp:inline distT="0" distB="0" distL="0" distR="0" wp14:anchorId="7CA7D89E" wp14:editId="5E66614D">
-            <wp:extent cx="5274310" cy="3540760"/>
-            <wp:effectExtent l="0" t="0" r="2540" b="2540"/>
-            <wp:docPr id="886386137" name="图片 8"/>
-            <wp:cNvGraphicFramePr>
-              <a:graphicFrameLocks xmlns:a="http://schemas.openxmlformats.org/drawingml/2006/main" noChangeAspect="1"/>
-            </wp:cNvGraphicFramePr>
-            <a:graphic xmlns:a="http://schemas.openxmlformats.org/drawingml/2006/main">
-              <a:graphicData uri="http://schemas.openxmlformats.org/drawingml/2006/picture">
-                <pic:pic xmlns:pic="http://schemas.openxmlformats.org/drawingml/2006/picture">
-                  <pic:nvPicPr>
-                    <pic:cNvPr id="0" name="Picture 18"/>
-                    <pic:cNvPicPr>
-                      <a:picLocks noChangeAspect="1" noChangeArrowheads="1"/>
-                    </pic:cNvPicPr>
-                  </pic:nvPicPr>
-                  <pic:blipFill>
-                    <a:blip r:embed="rId21" cstate="print">
-                      <a:extLst>
-                        <a:ext uri="{28A0092B-C50C-407E-A947-70E740481C1C}">
-                          <a14:useLocalDpi xmlns:a14="http://schemas.microsoft.com/office/drawing/2010/main" val="0"/>
-                        </a:ext>
-                      </a:extLst>
-                    </a:blip>
-                    <a:srcRect/>
-                    <a:stretch>
-                      <a:fillRect/>
-                    </a:stretch>
-                  </pic:blipFill>
-                  <pic:spPr bwMode="auto">
-                    <a:xfrm>
-                      <a:off x="0" y="0"/>
-                      <a:ext cx="5274310" cy="3540760"/>
-                    </a:xfrm>
-                    <a:prstGeom prst="rect">
-                      <a:avLst/>
-                    </a:prstGeom>
-                    <a:noFill/>
-                    <a:ln>
-                      <a:noFill/>
-                    </a:ln>
-                  </pic:spPr>
-                </pic:pic>
-              </a:graphicData>
-            </a:graphic>
-          </wp:inline>
-        </w:drawing>
-      </w:r>
-    </w:p>
     <w:sectPr>
-      <w:headerReference w:type="even" r:id="rId22"/>
-      <w:headerReference w:type="default" r:id="rId23"/>
-      <w:footerReference w:type="even" r:id="rId24"/>
-      <w:footerReference w:type="default" r:id="rId25"/>
-      <w:headerReference w:type="first" r:id="rId26"/>
-      <w:footerReference w:type="first" r:id="rId27"/>
+      <w:headerReference w:type="default" r:id="rId25"/>
+      <w:footerReference w:type="default" r:id="rId26"/>
       <w:pgSz w:w="11906" w:h="16838"/>
       <w:pgMar w:top="1440" w:right="1800" w:bottom="1440" w:left="1800" w:header="851" w:footer="992" w:gutter="0"/>
       <w:cols w:space="425"/>
@@ -1778,19 +1916,6 @@
 </file>
 
 <file path=word/footer1.xml><?xml version="1.0" encoding="utf-8"?>
-<w:ftr xmlns:wpc="http://schemas.microsoft.com/office/word/2010/wordprocessingCanvas" xmlns:cx="http://schemas.microsoft.com/office/drawing/2014/chartex" xmlns:cx1="http://schemas.microsoft.com/office/drawing/2015/9/8/chartex" xmlns:cx2="http://schemas.microsoft.com/office/drawing/2015/10/21/chartex" xmlns:cx3="http://schemas.microsoft.com/office/drawing/2016/5/9/chartex" xmlns:cx4="http://schemas.microsoft.com/office/drawing/2016/5/10/chartex" xmlns:cx5="http://schemas.microsoft.com/office/drawing/2016/5/11/chartex" xmlns:cx6="http://schemas.microsoft.com/office/drawing/2016/5/12/chartex" xmlns:cx7="http://schemas.microsoft.com/office/drawing/2016/5/13/chartex" xmlns:cx8="http://schemas.microsoft.com/office/drawing/2016/5/14/chartex" xmlns:mc="http://schemas.openxmlformats.org/markup-compatibility/2006" xmlns:aink="http://schemas.microsoft.com/office/drawing/2016/ink" xmlns:am3d="http://schemas.microsoft.com/office/drawing/2017/model3d" xmlns:o="urn:schemas-microsoft-com:office:office" xmlns:oel="http://schemas.microsoft.com/office/2019/extlst" xmlns:r="http://schemas.openxmlformats.org/officeDocument/2006/relationships" xmlns:m="http://schemas.openxmlformats.org/officeDocument/2006/math" xmlns:v="urn:schemas-microsoft-com:vml" xmlns:wp14="http://schemas.microsoft.com/office/word/2010/wordprocessingDrawing" xmlns:wp="http://schemas.openxmlformats.org/drawingml/2006/wordprocessingDrawing" xmlns:w10="urn:schemas-microsoft-com:office:word" xmlns:w="http://schemas.openxmlformats.org/wordprocessingml/2006/main" xmlns:w14="http://schemas.microsoft.com/office/word/2010/wordml" xmlns:w15="http://schemas.microsoft.com/office/word/2012/wordml" xmlns:w16cex="http://schemas.microsoft.com/office/word/2018/wordml/cex" xmlns:w16cid="http://schemas.microsoft.com/office/word/2016/wordml/cid" xmlns:w16="http://schemas.microsoft.com/office/word/2018/wordml" xmlns:w16du="http://schemas.microsoft.com/office/word/2023/wordml/word16du" xmlns:w16sdtdh="http://schemas.microsoft.com/office/word/2020/wordml/sdtdatahash" xmlns:w16sdtfl="http://schemas.microsoft.com/office/word/2024/wordml/sdtformatlock" xmlns:w16se="http://schemas.microsoft.com/office/word/2015/wordml/symex" xmlns:wpg="http://schemas.microsoft.com/office/word/2010/wordprocessingGroup" xmlns:wpi="http://schemas.microsoft.com/office/word/2010/wordprocessingInk" xmlns:wne="http://schemas.microsoft.com/office/word/2006/wordml" xmlns:wps="http://schemas.microsoft.com/office/word/2010/wordprocessingShape" mc:Ignorable="w14 w15 w16se w16cid w16 w16cex w16sdtdh w16sdtfl w16du wp14">
-  <w:p>
-    <w:pPr>
-      <w:pStyle w:val="af2"/>
-      <w:rPr>
-        <w:rFonts w:hint="eastAsia"/>
-      </w:rPr>
-    </w:pPr>
-  </w:p>
-</w:ftr>
-</file>
-
-<file path=word/footer2.xml><?xml version="1.0" encoding="utf-8"?>
 <w:ftr xmlns:wpc="http://schemas.microsoft.com/office/word/2010/wordprocessingCanvas" xmlns:cx="http://schemas.microsoft.com/office/drawing/2014/chartex" xmlns:cx1="http://schemas.microsoft.com/office/drawing/2015/9/8/chartex" xmlns:cx2="http://schemas.microsoft.com/office/drawing/2015/10/21/chartex" xmlns:cx3="http://schemas.microsoft.com/office/drawing/2016/5/9/chartex" xmlns:cx4="http://schemas.microsoft.com/office/drawing/2016/5/10/chartex" xmlns:cx5="http://schemas.microsoft.com/office/drawing/2016/5/11/chartex" xmlns:cx6="http://schemas.microsoft.com/office/drawing/2016/5/12/chartex" xmlns:cx7="http://schemas.microsoft.com/office/drawing/2016/5/13/chartex" xmlns:cx8="http://schemas.microsoft.com/office/drawing/2016/5/14/chartex" xmlns:mc="http://schemas.openxmlformats.org/markup-compatibility/2006" xmlns:aink="http://schemas.microsoft.com/office/drawing/2016/ink" xmlns:am3d="http://schemas.microsoft.com/office/drawing/2017/model3d" xmlns:o="urn:schemas-microsoft-com:office:office" xmlns:oel="http://schemas.microsoft.com/office/2019/extlst" xmlns:r="http://schemas.openxmlformats.org/officeDocument/2006/relationships" xmlns:m="http://schemas.openxmlformats.org/officeDocument/2006/math" xmlns:v="urn:schemas-microsoft-com:vml" xmlns:wp14="http://schemas.microsoft.com/office/word/2010/wordprocessingDrawing" xmlns:wp="http://schemas.openxmlformats.org/drawingml/2006/wordprocessingDrawing" xmlns:w10="urn:schemas-microsoft-com:office:word" xmlns:w="http://schemas.openxmlformats.org/wordprocessingml/2006/main" xmlns:w14="http://schemas.microsoft.com/office/word/2010/wordml" xmlns:w15="http://schemas.microsoft.com/office/word/2012/wordml" xmlns:w16cex="http://schemas.microsoft.com/office/word/2018/wordml/cex" xmlns:w16cid="http://schemas.microsoft.com/office/word/2016/wordml/cid" xmlns:w16="http://schemas.microsoft.com/office/word/2018/wordml" xmlns:w16du="http://schemas.microsoft.com/office/word/2023/wordml/word16du" xmlns:w16sdtdh="http://schemas.microsoft.com/office/word/2020/wordml/sdtdatahash" xmlns:w16sdtfl="http://schemas.microsoft.com/office/word/2024/wordml/sdtformatlock" xmlns:w16se="http://schemas.microsoft.com/office/word/2015/wordml/symex" xmlns:wpg="http://schemas.microsoft.com/office/word/2010/wordprocessingGroup" xmlns:wpi="http://schemas.microsoft.com/office/word/2010/wordprocessingInk" xmlns:wne="http://schemas.microsoft.com/office/word/2006/wordml" xmlns:wps="http://schemas.microsoft.com/office/word/2010/wordprocessingShape" mc:Ignorable="w14 w15 w16se w16cid w16 w16cex w16sdtdh w16sdtfl w16du wp14">
   <w:sdt>
     <w:sdtPr>
@@ -1841,19 +1966,6 @@
 </w:ftr>
 </file>
 
-<file path=word/footer3.xml><?xml version="1.0" encoding="utf-8"?>
-<w:ftr xmlns:wpc="http://schemas.microsoft.com/office/word/2010/wordprocessingCanvas" xmlns:cx="http://schemas.microsoft.com/office/drawing/2014/chartex" xmlns:cx1="http://schemas.microsoft.com/office/drawing/2015/9/8/chartex" xmlns:cx2="http://schemas.microsoft.com/office/drawing/2015/10/21/chartex" xmlns:cx3="http://schemas.microsoft.com/office/drawing/2016/5/9/chartex" xmlns:cx4="http://schemas.microsoft.com/office/drawing/2016/5/10/chartex" xmlns:cx5="http://schemas.microsoft.com/office/drawing/2016/5/11/chartex" xmlns:cx6="http://schemas.microsoft.com/office/drawing/2016/5/12/chartex" xmlns:cx7="http://schemas.microsoft.com/office/drawing/2016/5/13/chartex" xmlns:cx8="http://schemas.microsoft.com/office/drawing/2016/5/14/chartex" xmlns:mc="http://schemas.openxmlformats.org/markup-compatibility/2006" xmlns:aink="http://schemas.microsoft.com/office/drawing/2016/ink" xmlns:am3d="http://schemas.microsoft.com/office/drawing/2017/model3d" xmlns:o="urn:schemas-microsoft-com:office:office" xmlns:oel="http://schemas.microsoft.com/office/2019/extlst" xmlns:r="http://schemas.openxmlformats.org/officeDocument/2006/relationships" xmlns:m="http://schemas.openxmlformats.org/officeDocument/2006/math" xmlns:v="urn:schemas-microsoft-com:vml" xmlns:wp14="http://schemas.microsoft.com/office/word/2010/wordprocessingDrawing" xmlns:wp="http://schemas.openxmlformats.org/drawingml/2006/wordprocessingDrawing" xmlns:w10="urn:schemas-microsoft-com:office:word" xmlns:w="http://schemas.openxmlformats.org/wordprocessingml/2006/main" xmlns:w14="http://schemas.microsoft.com/office/word/2010/wordml" xmlns:w15="http://schemas.microsoft.com/office/word/2012/wordml" xmlns:w16cex="http://schemas.microsoft.com/office/word/2018/wordml/cex" xmlns:w16cid="http://schemas.microsoft.com/office/word/2016/wordml/cid" xmlns:w16="http://schemas.microsoft.com/office/word/2018/wordml" xmlns:w16du="http://schemas.microsoft.com/office/word/2023/wordml/word16du" xmlns:w16sdtdh="http://schemas.microsoft.com/office/word/2020/wordml/sdtdatahash" xmlns:w16sdtfl="http://schemas.microsoft.com/office/word/2024/wordml/sdtformatlock" xmlns:w16se="http://schemas.microsoft.com/office/word/2015/wordml/symex" xmlns:wpg="http://schemas.microsoft.com/office/word/2010/wordprocessingGroup" xmlns:wpi="http://schemas.microsoft.com/office/word/2010/wordprocessingInk" xmlns:wne="http://schemas.microsoft.com/office/word/2006/wordml" xmlns:wps="http://schemas.microsoft.com/office/word/2010/wordprocessingShape" mc:Ignorable="w14 w15 w16se w16cid w16 w16cex w16sdtdh w16sdtfl w16du wp14">
-  <w:p>
-    <w:pPr>
-      <w:pStyle w:val="af2"/>
-      <w:rPr>
-        <w:rFonts w:hint="eastAsia"/>
-      </w:rPr>
-    </w:pPr>
-  </w:p>
-</w:ftr>
-</file>
-
 <file path=word/footnotes.xml><?xml version="1.0" encoding="utf-8"?>
 <w:footnotes xmlns:wpc="http://schemas.microsoft.com/office/word/2010/wordprocessingCanvas" xmlns:cx="http://schemas.microsoft.com/office/drawing/2014/chartex" xmlns:cx1="http://schemas.microsoft.com/office/drawing/2015/9/8/chartex" xmlns:cx2="http://schemas.microsoft.com/office/drawing/2015/10/21/chartex" xmlns:cx3="http://schemas.microsoft.com/office/drawing/2016/5/9/chartex" xmlns:cx4="http://schemas.microsoft.com/office/drawing/2016/5/10/chartex" xmlns:cx5="http://schemas.microsoft.com/office/drawing/2016/5/11/chartex" xmlns:cx6="http://schemas.microsoft.com/office/drawing/2016/5/12/chartex" xmlns:cx7="http://schemas.microsoft.com/office/drawing/2016/5/13/chartex" xmlns:cx8="http://schemas.microsoft.com/office/drawing/2016/5/14/chartex" xmlns:mc="http://schemas.openxmlformats.org/markup-compatibility/2006" xmlns:aink="http://schemas.microsoft.com/office/drawing/2016/ink" xmlns:am3d="http://schemas.microsoft.com/office/drawing/2017/model3d" xmlns:o="urn:schemas-microsoft-com:office:office" xmlns:oel="http://schemas.microsoft.com/office/2019/extlst" xmlns:r="http://schemas.openxmlformats.org/officeDocument/2006/relationships" xmlns:m="http://schemas.openxmlformats.org/officeDocument/2006/math" xmlns:v="urn:schemas-microsoft-com:vml" xmlns:wp14="http://schemas.microsoft.com/office/word/2010/wordprocessingDrawing" xmlns:wp="http://schemas.openxmlformats.org/drawingml/2006/wordprocessingDrawing" xmlns:w10="urn:schemas-microsoft-com:office:word" xmlns:w="http://schemas.openxmlformats.org/wordprocessingml/2006/main" xmlns:w14="http://schemas.microsoft.com/office/word/2010/wordml" xmlns:w15="http://schemas.microsoft.com/office/word/2012/wordml" xmlns:w16cex="http://schemas.microsoft.com/office/word/2018/wordml/cex" xmlns:w16cid="http://schemas.microsoft.com/office/word/2016/wordml/cid" xmlns:w16="http://schemas.microsoft.com/office/word/2018/wordml" xmlns:w16du="http://schemas.microsoft.com/office/word/2023/wordml/word16du" xmlns:w16sdtdh="http://schemas.microsoft.com/office/word/2020/wordml/sdtdatahash" xmlns:w16sdtfl="http://schemas.microsoft.com/office/word/2024/wordml/sdtformatlock" xmlns:w16se="http://schemas.microsoft.com/office/word/2015/wordml/symex" xmlns:wpg="http://schemas.microsoft.com/office/word/2010/wordprocessingGroup" xmlns:wpi="http://schemas.microsoft.com/office/word/2010/wordprocessingInk" xmlns:wne="http://schemas.microsoft.com/office/word/2006/wordml" xmlns:wps="http://schemas.microsoft.com/office/word/2010/wordprocessingShape" mc:Ignorable="w14 w15 w16se w16cid w16 w16cex w16sdtdh w16sdtfl w16du wp14">
   <w:footnote w:type="separator" w:id="-1">
@@ -1892,19 +2004,6 @@
         <w:rFonts w:hint="eastAsia"/>
       </w:rPr>
     </w:pPr>
-  </w:p>
-</w:hdr>
-</file>
-
-<file path=word/header2.xml><?xml version="1.0" encoding="utf-8"?>
-<w:hdr xmlns:wpc="http://schemas.microsoft.com/office/word/2010/wordprocessingCanvas" xmlns:cx="http://schemas.microsoft.com/office/drawing/2014/chartex" xmlns:cx1="http://schemas.microsoft.com/office/drawing/2015/9/8/chartex" xmlns:cx2="http://schemas.microsoft.com/office/drawing/2015/10/21/chartex" xmlns:cx3="http://schemas.microsoft.com/office/drawing/2016/5/9/chartex" xmlns:cx4="http://schemas.microsoft.com/office/drawing/2016/5/10/chartex" xmlns:cx5="http://schemas.microsoft.com/office/drawing/2016/5/11/chartex" xmlns:cx6="http://schemas.microsoft.com/office/drawing/2016/5/12/chartex" xmlns:cx7="http://schemas.microsoft.com/office/drawing/2016/5/13/chartex" xmlns:cx8="http://schemas.microsoft.com/office/drawing/2016/5/14/chartex" xmlns:mc="http://schemas.openxmlformats.org/markup-compatibility/2006" xmlns:aink="http://schemas.microsoft.com/office/drawing/2016/ink" xmlns:am3d="http://schemas.microsoft.com/office/drawing/2017/model3d" xmlns:o="urn:schemas-microsoft-com:office:office" xmlns:oel="http://schemas.microsoft.com/office/2019/extlst" xmlns:r="http://schemas.openxmlformats.org/officeDocument/2006/relationships" xmlns:m="http://schemas.openxmlformats.org/officeDocument/2006/math" xmlns:v="urn:schemas-microsoft-com:vml" xmlns:wp14="http://schemas.microsoft.com/office/word/2010/wordprocessingDrawing" xmlns:wp="http://schemas.openxmlformats.org/drawingml/2006/wordprocessingDrawing" xmlns:w10="urn:schemas-microsoft-com:office:word" xmlns:w="http://schemas.openxmlformats.org/wordprocessingml/2006/main" xmlns:w14="http://schemas.microsoft.com/office/word/2010/wordml" xmlns:w15="http://schemas.microsoft.com/office/word/2012/wordml" xmlns:w16cex="http://schemas.microsoft.com/office/word/2018/wordml/cex" xmlns:w16cid="http://schemas.microsoft.com/office/word/2016/wordml/cid" xmlns:w16="http://schemas.microsoft.com/office/word/2018/wordml" xmlns:w16du="http://schemas.microsoft.com/office/word/2023/wordml/word16du" xmlns:w16sdtdh="http://schemas.microsoft.com/office/word/2020/wordml/sdtdatahash" xmlns:w16sdtfl="http://schemas.microsoft.com/office/word/2024/wordml/sdtformatlock" xmlns:w16se="http://schemas.microsoft.com/office/word/2015/wordml/symex" xmlns:wpg="http://schemas.microsoft.com/office/word/2010/wordprocessingGroup" xmlns:wpi="http://schemas.microsoft.com/office/word/2010/wordprocessingInk" xmlns:wne="http://schemas.microsoft.com/office/word/2006/wordml" xmlns:wps="http://schemas.microsoft.com/office/word/2010/wordprocessingShape" mc:Ignorable="w14 w15 w16se w16cid w16 w16cex w16sdtdh w16sdtfl w16du wp14">
-  <w:p>
-    <w:pPr>
-      <w:pStyle w:val="af0"/>
-      <w:rPr>
-        <w:rFonts w:hint="eastAsia"/>
-      </w:rPr>
-    </w:pPr>
     <w:r>
       <w:rPr>
         <w:rFonts w:hint="eastAsia"/>
@@ -1923,19 +2022,6 @@
       </w:rPr>
       <w:t>User Manual</w:t>
     </w:r>
-  </w:p>
-</w:hdr>
-</file>
-
-<file path=word/header3.xml><?xml version="1.0" encoding="utf-8"?>
-<w:hdr xmlns:wpc="http://schemas.microsoft.com/office/word/2010/wordprocessingCanvas" xmlns:cx="http://schemas.microsoft.com/office/drawing/2014/chartex" xmlns:cx1="http://schemas.microsoft.com/office/drawing/2015/9/8/chartex" xmlns:cx2="http://schemas.microsoft.com/office/drawing/2015/10/21/chartex" xmlns:cx3="http://schemas.microsoft.com/office/drawing/2016/5/9/chartex" xmlns:cx4="http://schemas.microsoft.com/office/drawing/2016/5/10/chartex" xmlns:cx5="http://schemas.microsoft.com/office/drawing/2016/5/11/chartex" xmlns:cx6="http://schemas.microsoft.com/office/drawing/2016/5/12/chartex" xmlns:cx7="http://schemas.microsoft.com/office/drawing/2016/5/13/chartex" xmlns:cx8="http://schemas.microsoft.com/office/drawing/2016/5/14/chartex" xmlns:mc="http://schemas.openxmlformats.org/markup-compatibility/2006" xmlns:aink="http://schemas.microsoft.com/office/drawing/2016/ink" xmlns:am3d="http://schemas.microsoft.com/office/drawing/2017/model3d" xmlns:o="urn:schemas-microsoft-com:office:office" xmlns:oel="http://schemas.microsoft.com/office/2019/extlst" xmlns:r="http://schemas.openxmlformats.org/officeDocument/2006/relationships" xmlns:m="http://schemas.openxmlformats.org/officeDocument/2006/math" xmlns:v="urn:schemas-microsoft-com:vml" xmlns:wp14="http://schemas.microsoft.com/office/word/2010/wordprocessingDrawing" xmlns:wp="http://schemas.openxmlformats.org/drawingml/2006/wordprocessingDrawing" xmlns:w10="urn:schemas-microsoft-com:office:word" xmlns:w="http://schemas.openxmlformats.org/wordprocessingml/2006/main" xmlns:w14="http://schemas.microsoft.com/office/word/2010/wordml" xmlns:w15="http://schemas.microsoft.com/office/word/2012/wordml" xmlns:w16cex="http://schemas.microsoft.com/office/word/2018/wordml/cex" xmlns:w16cid="http://schemas.microsoft.com/office/word/2016/wordml/cid" xmlns:w16="http://schemas.microsoft.com/office/word/2018/wordml" xmlns:w16du="http://schemas.microsoft.com/office/word/2023/wordml/word16du" xmlns:w16sdtdh="http://schemas.microsoft.com/office/word/2020/wordml/sdtdatahash" xmlns:w16sdtfl="http://schemas.microsoft.com/office/word/2024/wordml/sdtformatlock" xmlns:w16se="http://schemas.microsoft.com/office/word/2015/wordml/symex" xmlns:wpg="http://schemas.microsoft.com/office/word/2010/wordprocessingGroup" xmlns:wpi="http://schemas.microsoft.com/office/word/2010/wordprocessingInk" xmlns:wne="http://schemas.microsoft.com/office/word/2006/wordml" xmlns:wps="http://schemas.microsoft.com/office/word/2010/wordprocessingShape" mc:Ignorable="w14 w15 w16se w16cid w16 w16cex w16sdtdh w16sdtfl w16du wp14">
-  <w:p>
-    <w:pPr>
-      <w:pStyle w:val="af0"/>
-      <w:rPr>
-        <w:rFonts w:hint="eastAsia"/>
-      </w:rPr>
-    </w:pPr>
   </w:p>
 </w:hdr>
 </file>
@@ -3568,7 +3654,6 @@
   <w:style w:type="character" w:default="1" w:styleId="a0">
     <w:name w:val="Default Paragraph Font"/>
     <w:uiPriority w:val="1"/>
-    <w:semiHidden/>
     <w:unhideWhenUsed/>
   </w:style>
   <w:style w:type="table" w:default="1" w:styleId="a1">

</xml_diff>